<commit_message>
docs: update evidence doc - INSERT evidence only, rollback removed
</commit_message>
<xml_diff>
--- a/workstreams/production-stability/sql-scripts/Issue1052_Evidence_COPS_DEV.docx
+++ b/workstreams/production-stability/sql-scripts/Issue1052_Evidence_COPS_DEV.docx
@@ -314,7 +314,7 @@
         <w:rPr>
           <w:sz w:val="20"/>
         </w:rPr>
-        <w:t>This document provides evidence that the check rule SQL scripts for Issue_1052 have been successfully tested. The scripts implement check rules for 131 PHD tags (added since 1 Dec 2025) that had NO check rule validation configured in the system.</w:t>
+        <w:t>This document provides evidence that the check rule SQL script for Issue_1052 has been successfully tested in the COPS DEV environment. The script implements check rules for 131 PHD tags (added since 1 Dec 2025) that had NO check rule validation configured.</w:t>
       </w:r>
     </w:p>
     <w:p>
@@ -322,7 +322,7 @@
         <w:pStyle w:val="Heading1"/>
       </w:pPr>
       <w:r>
-        <w:t>2. Scripts Tested</w:t>
+        <w:t>2. Script Tested</w:t>
       </w:r>
     </w:p>
     <w:tbl>
@@ -425,59 +425,7 @@
                 <w:b w:val="0"/>
                 <w:sz w:val="17"/>
               </w:rPr>
-              <w:t>INSERT/UPDATE 8 check rules — UPDATE-then-INSERT pattern (re-runnable)</w:t>
-            </w:r>
-          </w:p>
-        </w:tc>
-        <w:tc>
-          <w:tcPr>
-            <w:tcW w:type="dxa" w:w="3324"/>
-            <w:shd w:val="clear" w:color="auto" w:fill="00B050"/>
-          </w:tcPr>
-          <w:p>
-            <w:pPr>
-              <w:jc w:val="center"/>
-            </w:pPr>
-            <w:r/>
-            <w:r>
-              <w:rPr>
-                <w:b/>
-                <w:color w:val="FFFFFF"/>
-                <w:sz w:val="18"/>
-              </w:rPr>
-              <w:t>PASS  ✅</w:t>
-            </w:r>
-          </w:p>
-        </w:tc>
-      </w:tr>
-      <w:tr>
-        <w:tc>
-          <w:tcPr>
-            <w:tcW w:type="dxa" w:w="3324"/>
-          </w:tcPr>
-          <w:p>
-            <w:r/>
-            <w:r>
-              <w:rPr>
-                <w:b w:val="0"/>
-                <w:sz w:val="17"/>
-              </w:rPr>
-              <w:t>Issue1052_PHD_Check_Rules_ROLLBACK.sql</w:t>
-            </w:r>
-          </w:p>
-        </w:tc>
-        <w:tc>
-          <w:tcPr>
-            <w:tcW w:type="dxa" w:w="3324"/>
-          </w:tcPr>
-          <w:p>
-            <w:r/>
-            <w:r>
-              <w:rPr>
-                <w:b w:val="0"/>
-                <w:sz w:val="17"/>
-              </w:rPr>
-              <w:t>DELETE 8 check rules + variables — for cleanup and re-testing</w:t>
+              <w:t>INSERT / UPDATE 8 check rules — UPDATE-then-INSERT pattern (re-runnable)</w:t>
             </w:r>
           </w:p>
         </w:tc>
@@ -824,152 +772,6 @@
           </w:p>
         </w:tc>
       </w:tr>
-      <w:tr>
-        <w:tc>
-          <w:tcPr>
-            <w:tcW w:type="dxa" w:w="2493"/>
-            <w:shd w:val="clear" w:color="auto" w:fill="FFFFFF"/>
-          </w:tcPr>
-          <w:p>
-            <w:pPr>
-              <w:jc w:val="center"/>
-            </w:pPr>
-            <w:r/>
-            <w:r>
-              <w:rPr>
-                <w:b w:val="0"/>
-                <w:sz w:val="18"/>
-              </w:rPr>
-              <w:t>4</w:t>
-            </w:r>
-          </w:p>
-        </w:tc>
-        <w:tc>
-          <w:tcPr>
-            <w:tcW w:type="dxa" w:w="2493"/>
-            <w:shd w:val="clear" w:color="auto" w:fill="FFFFFF"/>
-          </w:tcPr>
-          <w:p>
-            <w:r/>
-            <w:r>
-              <w:rPr>
-                <w:b w:val="0"/>
-                <w:sz w:val="17"/>
-              </w:rPr>
-              <w:t>Run Issue1052_PHD_Check_Rules_ROLLBACK.sql</w:t>
-              <w:br/>
-              <w:t>8 rules DELETED, COMMIT OK</w:t>
-            </w:r>
-          </w:p>
-        </w:tc>
-        <w:tc>
-          <w:tcPr>
-            <w:tcW w:type="dxa" w:w="2493"/>
-            <w:shd w:val="clear" w:color="auto" w:fill="FFFFFF"/>
-          </w:tcPr>
-          <w:p>
-            <w:pPr>
-              <w:jc w:val="center"/>
-            </w:pPr>
-            <w:r/>
-            <w:r>
-              <w:rPr>
-                <w:b w:val="0"/>
-                <w:sz w:val="17"/>
-              </w:rPr>
-              <w:t>8 DELETED</w:t>
-            </w:r>
-          </w:p>
-        </w:tc>
-        <w:tc>
-          <w:tcPr>
-            <w:tcW w:type="dxa" w:w="2493"/>
-            <w:shd w:val="clear" w:color="auto" w:fill="E2EFDA"/>
-          </w:tcPr>
-          <w:p>
-            <w:r/>
-            <w:r>
-              <w:rPr>
-                <w:b/>
-                <w:sz w:val="17"/>
-              </w:rPr>
-              <w:t>8 rules DELETED    PASS</w:t>
-            </w:r>
-          </w:p>
-        </w:tc>
-      </w:tr>
-      <w:tr>
-        <w:tc>
-          <w:tcPr>
-            <w:tcW w:type="dxa" w:w="2493"/>
-            <w:shd w:val="clear" w:color="auto" w:fill="F2F2F2"/>
-          </w:tcPr>
-          <w:p>
-            <w:pPr>
-              <w:jc w:val="center"/>
-            </w:pPr>
-            <w:r/>
-            <w:r>
-              <w:rPr>
-                <w:b w:val="0"/>
-                <w:sz w:val="18"/>
-              </w:rPr>
-              <w:t>5</w:t>
-            </w:r>
-          </w:p>
-        </w:tc>
-        <w:tc>
-          <w:tcPr>
-            <w:tcW w:type="dxa" w:w="2493"/>
-            <w:shd w:val="clear" w:color="auto" w:fill="F2F2F2"/>
-          </w:tcPr>
-          <w:p>
-            <w:r/>
-            <w:r>
-              <w:rPr>
-                <w:b w:val="0"/>
-                <w:sz w:val="17"/>
-              </w:rPr>
-              <w:t>Verify after ROLLBACK — clean state restored</w:t>
-            </w:r>
-          </w:p>
-        </w:tc>
-        <w:tc>
-          <w:tcPr>
-            <w:tcW w:type="dxa" w:w="2493"/>
-            <w:shd w:val="clear" w:color="auto" w:fill="F2F2F2"/>
-          </w:tcPr>
-          <w:p>
-            <w:pPr>
-              <w:jc w:val="center"/>
-            </w:pPr>
-            <w:r/>
-            <w:r>
-              <w:rPr>
-                <w:b w:val="0"/>
-                <w:sz w:val="17"/>
-              </w:rPr>
-              <w:t>0 rows</w:t>
-            </w:r>
-          </w:p>
-        </w:tc>
-        <w:tc>
-          <w:tcPr>
-            <w:tcW w:type="dxa" w:w="2493"/>
-            <w:shd w:val="clear" w:color="auto" w:fill="E2EFDA"/>
-          </w:tcPr>
-          <w:p>
-            <w:r/>
-            <w:r>
-              <w:rPr>
-                <w:b/>
-                <w:sz w:val="17"/>
-              </w:rPr>
-              <w:t>0 rows confirmed    PASS</w:t>
-            </w:r>
-          </w:p>
-        </w:tc>
-      </w:tr>
     </w:tbl>
     <w:p/>
     <w:p>
@@ -977,7 +779,7 @@
         <w:pStyle w:val="Heading1"/>
       </w:pPr>
       <w:r>
-        <w:t>4. Database Evidence — Check Rules Verified (After INSERT)</w:t>
+        <w:t>4. Database Evidence — Check Rules Verified</w:t>
       </w:r>
     </w:p>
     <w:p>
@@ -1923,7 +1725,7 @@
         <w:rPr>
           <w:sz w:val="20"/>
         </w:rPr>
-        <w:t>After running the INSERT script, navigate to the following EC screens to capture screenshots as visual evidence. Paste screenshots in the placeholder boxes below.</w:t>
+        <w:t>After running the INSERT script, navigate to the following EC screens and paste screenshots in the placeholder boxes below.</w:t>
       </w:r>
     </w:p>
     <w:p>
@@ -1942,7 +1744,7 @@
         </w:rPr>
         <w:t>Path: Admin &gt; Configuration &gt; Maintain Check Rules</w:t>
         <w:br/>
-        <w:t>Filter by CHECK_NAME = PHD_STRM_COMP_MOL_PCT_VAL1</w:t>
+        <w:t>Filter: CHECK_NAME = PHD_STRM_COMP_MOL_PCT_VAL1</w:t>
         <w:br/>
         <w:t>Verify: TABLE_ID = RV_STRM_COMP_ANALYSIS | SEVERITY_LEVEL = ERROR | REV_TEXT = ECPR-Issue1052</w:t>
       </w:r>
@@ -2012,7 +1814,7 @@
           <w:color w:val="444444"/>
           <w:sz w:val="18"/>
         </w:rPr>
-        <w:t>Select rule: PHD_STRM_COMP_MOL_PCT_VAL1 &gt; click Variables tab</w:t>
+        <w:t>Select rule: PHD_STRM_COMP_MOL_PCT_VAL1 &gt; Variables tab</w:t>
         <w:br/>
         <w:t>Verify: VARIABLE_NAME = MolPct | VARIABLE_TYPE = ATTRIBUTE | VARIABLE_VALUE = MOL_PCT</w:t>
       </w:r>
@@ -2084,9 +1886,9 @@
         </w:rPr>
         <w:t>Path: Admin &gt; Validation &gt; Validation Overview</w:t>
         <w:br/>
-        <w:t>Run check rules on STRM_COMP_ANALYSIS class for a date with data</w:t>
+        <w:t>Run check rules on STRM_COMP_ANALYSIS class</w:t>
         <w:br/>
-        <w:t>Verify: PHD_STRM_COMP_MOL_PCT_VAL1 fires when MOL_PCT is NULL or out of range (0-100)</w:t>
+        <w:t>Verify: PHD_STRM_COMP_MOL_PCT_VAL1 fires correctly</w:t>
       </w:r>
     </w:p>
     <w:tbl>

</xml_diff>

<commit_message>
docs: add EC web app screenshots to Issue_1052 evidence document
</commit_message>
<xml_diff>
--- a/workstreams/production-stability/sql-scripts/Issue1052_Evidence_COPS_DEV.docx
+++ b/workstreams/production-stability/sql-scripts/Issue1052_Evidence_COPS_DEV.docx
@@ -1717,15 +1717,17 @@
         <w:pStyle w:val="Heading1"/>
       </w:pPr>
       <w:r>
-        <w:t>5. EC Web App Screen Evidence</w:t>
+        <w:t>5. EC Web App Screen Evidence — Maintain Check Rules (CO.0201)</w:t>
       </w:r>
     </w:p>
     <w:p>
       <w:r>
         <w:rPr>
-          <w:sz w:val="20"/>
+          <w:sz w:val="18"/>
         </w:rPr>
-        <w:t>After running the INSERT script, navigate to the following EC screens and paste screenshots in the placeholder boxes below.</w:t>
+        <w:t>Screenshots captured from EC Web App (https://app-plutodev.woodside-pluto.tieto-og.cloud/) showing the 8 PHD check rules successfully created in the Maintain Check Rules screen.</w:t>
+        <w:br/>
+        <w:t>All 8 rules visible across page 6 (rule 1142) and page 7 (rules 1143-1149).</w:t>
       </w:r>
     </w:p>
     <w:p>
@@ -1733,214 +1735,114 @@
         <w:pStyle w:val="Heading2"/>
       </w:pPr>
       <w:r>
-        <w:t xml:space="preserve">  Screen 1: Maintain Check Rules — CO.0201</w:t>
+        <w:t xml:space="preserve">  Screen 1A — Maintain Check Rules (Page 6 of 7)</w:t>
       </w:r>
     </w:p>
     <w:p>
       <w:r>
         <w:rPr>
-          <w:color w:val="444444"/>
-          <w:sz w:val="18"/>
+          <w:color w:val="606060"/>
+          <w:sz w:val="16"/>
         </w:rPr>
-        <w:t>Path: Admin &gt; Configuration &gt; Maintain Check Rules</w:t>
-        <w:br/>
-        <w:t>Filter: CHECK_NAME = PHD_STRM_COMP_MOL_PCT_VAL1</w:t>
-        <w:br/>
-        <w:t>Verify: TABLE_ID = RV_STRM_COMP_ANALYSIS | SEVERITY_LEVEL = ERROR | REV_TEXT = ECPR-Issue1052</w:t>
+        <w:t>Rule 1142: PHD_STRM_COMP_MOL_PCT_VAL1 visible at bottom — TABLE_ID: RV_STRM_COMP_ANALYSIS</w:t>
       </w:r>
     </w:p>
-    <w:tbl>
-      <w:tblPr>
-        <w:tblStyle w:val="TableGrid"/>
-        <w:tblW w:type="auto" w:w="0"/>
-        <w:tblLook w:firstColumn="1" w:firstRow="1" w:lastColumn="0" w:lastRow="0" w:noHBand="0" w:noVBand="1" w:val="04A0"/>
-      </w:tblPr>
-      <w:tblGrid>
-        <w:gridCol w:w="9972"/>
-      </w:tblGrid>
-      <w:tr>
-        <w:tc>
-          <w:tcPr>
-            <w:tcW w:type="dxa" w:w="9972"/>
-            <w:shd w:val="clear" w:color="auto" w:fill="F8F8F8"/>
-          </w:tcPr>
-          <w:p>
-            <w:pPr>
-              <w:jc w:val="center"/>
-            </w:pPr>
-            <w:r/>
-            <w:r>
-              <w:br/>
-            </w:r>
-            <w:r>
-              <w:br/>
-            </w:r>
-            <w:r>
-              <w:br/>
-            </w:r>
-            <w:r>
-              <w:rPr>
-                <w:i/>
-                <w:color w:val="AAAAAA"/>
-                <w:sz w:val="20"/>
-              </w:rPr>
-              <w:t>[ INSERT SCREENSHOT HERE — Maintain Check Rules — CO.0201 ]</w:t>
-            </w:r>
-            <w:r>
-              <w:br/>
-            </w:r>
-            <w:r>
-              <w:br/>
-            </w:r>
-            <w:r>
-              <w:br/>
-            </w:r>
-          </w:p>
-        </w:tc>
-      </w:tr>
-    </w:tbl>
+    <w:p>
+      <w:pPr>
+        <w:jc w:val="center"/>
+      </w:pPr>
+      <w:r>
+        <w:drawing>
+          <wp:inline xmlns:a="http://schemas.openxmlformats.org/drawingml/2006/main" xmlns:pic="http://schemas.openxmlformats.org/drawingml/2006/picture">
+            <wp:extent cx="5943600" cy="3343275"/>
+            <wp:docPr id="1" name="Picture 1"/>
+            <wp:cNvGraphicFramePr>
+              <a:graphicFrameLocks noChangeAspect="1"/>
+            </wp:cNvGraphicFramePr>
+            <a:graphic>
+              <a:graphicData uri="http://schemas.openxmlformats.org/drawingml/2006/picture">
+                <pic:pic>
+                  <pic:nvPicPr>
+                    <pic:cNvPr id="0" name="screen1_page6.png"/>
+                    <pic:cNvPicPr/>
+                  </pic:nvPicPr>
+                  <pic:blipFill>
+                    <a:blip r:embed="rId9"/>
+                    <a:stretch>
+                      <a:fillRect/>
+                    </a:stretch>
+                  </pic:blipFill>
+                  <pic:spPr>
+                    <a:xfrm>
+                      <a:off x="0" y="0"/>
+                      <a:ext cx="5943600" cy="3343275"/>
+                    </a:xfrm>
+                    <a:prstGeom prst="rect"/>
+                  </pic:spPr>
+                </pic:pic>
+              </a:graphicData>
+            </a:graphic>
+          </wp:inline>
+        </w:drawing>
+      </w:r>
+    </w:p>
     <w:p/>
     <w:p>
       <w:pPr>
         <w:pStyle w:val="Heading2"/>
       </w:pPr>
       <w:r>
-        <w:t xml:space="preserve">  Screen 2: Check Rule Variables — CO.0201 Variables Tab</w:t>
+        <w:t xml:space="preserve">  Screen 1B — Maintain Check Rules (Page 7 of 7)</w:t>
       </w:r>
     </w:p>
     <w:p>
       <w:r>
         <w:rPr>
-          <w:color w:val="444444"/>
-          <w:sz w:val="18"/>
+          <w:color w:val="606060"/>
+          <w:sz w:val="16"/>
         </w:rPr>
-        <w:t>Select rule: PHD_STRM_COMP_MOL_PCT_VAL1 &gt; Variables tab</w:t>
-        <w:br/>
-        <w:t>Verify: VARIABLE_NAME = MolPct | VARIABLE_TYPE = ATTRIBUTE | VARIABLE_VALUE = MOL_PCT</w:t>
-      </w:r>
-    </w:p>
-    <w:tbl>
-      <w:tblPr>
-        <w:tblStyle w:val="TableGrid"/>
-        <w:tblW w:type="auto" w:w="0"/>
-        <w:tblLook w:firstColumn="1" w:firstRow="1" w:lastColumn="0" w:lastRow="0" w:noHBand="0" w:noVBand="1" w:val="04A0"/>
-      </w:tblPr>
-      <w:tblGrid>
-        <w:gridCol w:w="9972"/>
-      </w:tblGrid>
-      <w:tr>
-        <w:tc>
-          <w:tcPr>
-            <w:tcW w:type="dxa" w:w="9972"/>
-            <w:shd w:val="clear" w:color="auto" w:fill="F8F8F8"/>
-          </w:tcPr>
-          <w:p>
-            <w:pPr>
-              <w:jc w:val="center"/>
-            </w:pPr>
-            <w:r/>
-            <w:r>
-              <w:br/>
-            </w:r>
-            <w:r>
-              <w:br/>
-            </w:r>
-            <w:r>
-              <w:br/>
-            </w:r>
-            <w:r>
-              <w:rPr>
-                <w:i/>
-                <w:color w:val="AAAAAA"/>
-                <w:sz w:val="20"/>
-              </w:rPr>
-              <w:t>[ INSERT SCREENSHOT HERE — Check Rule Variables — CO.0201 Variables Tab ]</w:t>
-            </w:r>
-            <w:r>
-              <w:br/>
-            </w:r>
-            <w:r>
-              <w:br/>
-            </w:r>
-            <w:r>
-              <w:br/>
-            </w:r>
-          </w:p>
-        </w:tc>
-      </w:tr>
-    </w:tbl>
-    <w:p/>
-    <w:p>
-      <w:pPr>
-        <w:pStyle w:val="Heading2"/>
-      </w:pPr>
-      <w:r>
-        <w:t xml:space="preserve">  Screen 3: Validation Overview — CO.0203</w:t>
+        <w:t>Rules 1143–1149 all visible — TANK_DAY_DIP_STATUS and STRM_ANALYSIS rules</w:t>
       </w:r>
     </w:p>
     <w:p>
+      <w:pPr>
+        <w:jc w:val="center"/>
+      </w:pPr>
       <w:r>
-        <w:rPr>
-          <w:color w:val="444444"/>
-          <w:sz w:val="18"/>
-        </w:rPr>
-        <w:t>Path: Admin &gt; Validation &gt; Validation Overview</w:t>
-        <w:br/>
-        <w:t>Run check rules on STRM_COMP_ANALYSIS class</w:t>
-        <w:br/>
-        <w:t>Verify: PHD_STRM_COMP_MOL_PCT_VAL1 fires correctly</w:t>
+        <w:drawing>
+          <wp:inline xmlns:a="http://schemas.openxmlformats.org/drawingml/2006/main" xmlns:pic="http://schemas.openxmlformats.org/drawingml/2006/picture">
+            <wp:extent cx="5943600" cy="3343275"/>
+            <wp:docPr id="2" name="Picture 2"/>
+            <wp:cNvGraphicFramePr>
+              <a:graphicFrameLocks noChangeAspect="1"/>
+            </wp:cNvGraphicFramePr>
+            <a:graphic>
+              <a:graphicData uri="http://schemas.openxmlformats.org/drawingml/2006/picture">
+                <pic:pic>
+                  <pic:nvPicPr>
+                    <pic:cNvPr id="0" name="screen1_phd_rules_page7.png"/>
+                    <pic:cNvPicPr/>
+                  </pic:nvPicPr>
+                  <pic:blipFill>
+                    <a:blip r:embed="rId10"/>
+                    <a:stretch>
+                      <a:fillRect/>
+                    </a:stretch>
+                  </pic:blipFill>
+                  <pic:spPr>
+                    <a:xfrm>
+                      <a:off x="0" y="0"/>
+                      <a:ext cx="5943600" cy="3343275"/>
+                    </a:xfrm>
+                    <a:prstGeom prst="rect"/>
+                  </pic:spPr>
+                </pic:pic>
+              </a:graphicData>
+            </a:graphic>
+          </wp:inline>
+        </w:drawing>
       </w:r>
     </w:p>
-    <w:tbl>
-      <w:tblPr>
-        <w:tblStyle w:val="TableGrid"/>
-        <w:tblW w:type="auto" w:w="0"/>
-        <w:tblLook w:firstColumn="1" w:firstRow="1" w:lastColumn="0" w:lastRow="0" w:noHBand="0" w:noVBand="1" w:val="04A0"/>
-      </w:tblPr>
-      <w:tblGrid>
-        <w:gridCol w:w="9972"/>
-      </w:tblGrid>
-      <w:tr>
-        <w:tc>
-          <w:tcPr>
-            <w:tcW w:type="dxa" w:w="9972"/>
-            <w:shd w:val="clear" w:color="auto" w:fill="F8F8F8"/>
-          </w:tcPr>
-          <w:p>
-            <w:pPr>
-              <w:jc w:val="center"/>
-            </w:pPr>
-            <w:r/>
-            <w:r>
-              <w:br/>
-            </w:r>
-            <w:r>
-              <w:br/>
-            </w:r>
-            <w:r>
-              <w:br/>
-            </w:r>
-            <w:r>
-              <w:rPr>
-                <w:i/>
-                <w:color w:val="AAAAAA"/>
-                <w:sz w:val="20"/>
-              </w:rPr>
-              <w:t>[ INSERT SCREENSHOT HERE — Validation Overview — CO.0203 ]</w:t>
-            </w:r>
-            <w:r>
-              <w:br/>
-            </w:r>
-            <w:r>
-              <w:br/>
-            </w:r>
-            <w:r>
-              <w:br/>
-            </w:r>
-          </w:p>
-        </w:tc>
-      </w:tr>
-    </w:tbl>
     <w:p/>
     <w:p>
       <w:pPr>

</xml_diff>

<commit_message>
fix: remove Project Management Methodology, replace Technical Gap Analysis with Test Evidence
</commit_message>
<xml_diff>
--- a/workstreams/production-stability/sql-scripts/Issue1052_Evidence_COPS_DEV.docx
+++ b/workstreams/production-stability/sql-scripts/Issue1052_Evidence_COPS_DEV.docx
@@ -2,22 +2,6 @@
 <file path=word/document.xml><?xml version="1.0" encoding="utf-8"?>
 <w:document xmlns:wpc="http://schemas.microsoft.com/office/word/2010/wordprocessingCanvas" xmlns:mc="http://schemas.openxmlformats.org/markup-compatibility/2006" xmlns:o="urn:schemas-microsoft-com:office:office" xmlns:r="http://schemas.openxmlformats.org/officeDocument/2006/relationships" xmlns:m="http://schemas.openxmlformats.org/officeDocument/2006/math" xmlns:v="urn:schemas-microsoft-com:vml" xmlns:wp14="http://schemas.microsoft.com/office/word/2010/wordprocessingDrawing" xmlns:wp="http://schemas.openxmlformats.org/drawingml/2006/wordprocessingDrawing" xmlns:w10="urn:schemas-microsoft-com:office:word" xmlns:w="http://schemas.openxmlformats.org/wordprocessingml/2006/main" xmlns:w14="http://schemas.microsoft.com/office/word/2010/wordml" xmlns:wpg="http://schemas.microsoft.com/office/word/2010/wordprocessingGroup" xmlns:wpi="http://schemas.microsoft.com/office/word/2010/wordprocessingInk" xmlns:wne="http://schemas.microsoft.com/office/word/2006/wordml" xmlns:wps="http://schemas.microsoft.com/office/word/2010/wordprocessingShape" mc:Ignorable="w14 wp14">
   <w:body>
-    <w:p>
-      <w:pPr>
-        <w:pStyle w:val="NormalBoxtext"/>
-        <w:jc w:val="left"/>
-      </w:pPr>
-      <w:r>
-        <w:rPr>
-          <w:rFonts w:ascii="Arial" w:hAnsi="Arial"/>
-          <w:b/>
-          <w:color w:val="548DD4"/>
-          <w:sz w:val="20"/>
-        </w:rPr>
-        <w:tab/>
-        <w:t>Project Management Methodology</w:t>
-      </w:r>
-    </w:p>
     <w:p>
       <w:pPr>
         <w:pStyle w:val="Title"/>
@@ -2618,7 +2602,7 @@
         <w:sz w:val="28"/>
         <w:szCs w:val="32"/>
       </w:rPr>
-      <w:t>Technical Gap Analysis</w:t>
+      <w:t>Test Evidence</w:t>
     </w:r>
     <w:r>
       <w:rPr>

</xml_diff>

<commit_message>
Issue_1052 Evidence Doc: add Check Groups (§8) + Phase 2 RF UI test (§9)
Extended the COPS DEV evidence doc with two new sections (Phase 1 sections 1-7
untouched, screenshots preserved):
- §8 Check Group Creation & Rule Linkage: 3 groups + 8 rule links (live DB),
  deploy + idempotency results. Rollback SQL file EXCLUDED (deploy-only).
- §9 Phase 2 RF UI Test: EC result vs independent per-object DB oracle (8/8
  rules match), RF run results (11/11 pass), and §9.3 Screen Evidence with two
  screenshots (Validation Overview showing 8/13/6 Errors; RF report 11/11).
All data pulled live from COPS DEV + the actual RF run output (not hand-typed).

Co-Authored-By: Claude Opus 4.8 (1M context) <noreply@anthropic.com>
</commit_message>
<xml_diff>
--- a/workstreams/production-stability/sql-scripts/Issue1052_Evidence_COPS_DEV.docx
+++ b/workstreams/production-stability/sql-scripts/Issue1052_Evidence_COPS_DEV.docx
@@ -22460,6 +22460,2715 @@
         <w:t>Tested by: Choong-Yin Lee    |    Date: 04 June 2026    |    Environment: COPS DEV (EC 14.1.5.1)</w:t>
       </w:r>
     </w:p>
+    <w:p>
+      <w:r>
+        <w:br w:type="page"/>
+      </w:r>
+    </w:p>
+    <w:p>
+      <w:pPr>
+        <w:pStyle w:val="Heading1"/>
+      </w:pPr>
+      <w:r>
+        <w:t>8. Check Group Creation &amp; Rule Linkage</w:t>
+      </w:r>
+    </w:p>
+    <w:p>
+      <w:r>
+        <w:rPr>
+          <w:sz w:val="20"/>
+        </w:rPr>
+        <w:t>The 8 check rules above were bundled into runnable check groups. EC resolves a group’s rules via the junction table CTRL_CHECK_COMBINATION (CHECK_GROUP &lt;-&gt; CHECK_ID) — not via the screen. Three new groups were created under parent V_DAILY_PHD_VALIDATION, each linked to its EC screen and its rules, and deployed to COPS DEV.</w:t>
+      </w:r>
+    </w:p>
+    <w:p>
+      <w:pPr>
+        <w:pStyle w:val="Heading2"/>
+      </w:pPr>
+      <w:r>
+        <w:t>8.1 Scripts</w:t>
+      </w:r>
+    </w:p>
+    <w:tbl>
+      <w:tblPr>
+        <w:tblStyle w:val="TableGrid"/>
+        <w:tblW w:type="auto" w:w="0"/>
+        <w:tblLook w:firstColumn="1" w:firstRow="1" w:lastColumn="0" w:lastRow="0" w:noHBand="0" w:noVBand="1" w:val="04A0"/>
+      </w:tblPr>
+      <w:tblGrid>
+        <w:gridCol w:w="3360"/>
+        <w:gridCol w:w="3360"/>
+        <w:gridCol w:w="3360"/>
+      </w:tblGrid>
+      <w:tr>
+        <w:tc>
+          <w:tcPr>
+            <w:tcW w:type="dxa" w:w="3360"/>
+            <w:shd w:val="clear" w:color="auto" w:fill="1F497D"/>
+          </w:tcPr>
+          <w:p>
+            <w:pPr>
+              <w:jc w:val="center"/>
+            </w:pPr>
+            <w:r/>
+            <w:r>
+              <w:rPr>
+                <w:b/>
+                <w:color w:val="FFFFFF"/>
+                <w:sz w:val="18"/>
+              </w:rPr>
+              <w:t>Script File</w:t>
+            </w:r>
+          </w:p>
+        </w:tc>
+        <w:tc>
+          <w:tcPr>
+            <w:tcW w:type="dxa" w:w="3360"/>
+            <w:shd w:val="clear" w:color="auto" w:fill="1F497D"/>
+          </w:tcPr>
+          <w:p>
+            <w:pPr>
+              <w:jc w:val="center"/>
+            </w:pPr>
+            <w:r/>
+            <w:r>
+              <w:rPr>
+                <w:b/>
+                <w:color w:val="FFFFFF"/>
+                <w:sz w:val="18"/>
+              </w:rPr>
+              <w:t>Purpose</w:t>
+            </w:r>
+          </w:p>
+        </w:tc>
+        <w:tc>
+          <w:tcPr>
+            <w:tcW w:type="dxa" w:w="3360"/>
+            <w:shd w:val="clear" w:color="auto" w:fill="1F497D"/>
+          </w:tcPr>
+          <w:p>
+            <w:pPr>
+              <w:jc w:val="center"/>
+            </w:pPr>
+            <w:r/>
+            <w:r>
+              <w:rPr>
+                <w:b/>
+                <w:color w:val="FFFFFF"/>
+                <w:sz w:val="18"/>
+              </w:rPr>
+              <w:t>Status</w:t>
+            </w:r>
+          </w:p>
+        </w:tc>
+      </w:tr>
+      <w:tr>
+        <w:tc>
+          <w:tcPr>
+            <w:tcW w:type="dxa" w:w="3360"/>
+          </w:tcPr>
+          <w:p>
+            <w:r/>
+            <w:r>
+              <w:rPr>
+                <w:b w:val="0"/>
+                <w:sz w:val="17"/>
+              </w:rPr>
+              <w:t>Issue1052_PHD_Check_Group.sql</w:t>
+            </w:r>
+          </w:p>
+        </w:tc>
+        <w:tc>
+          <w:tcPr>
+            <w:tcW w:type="dxa" w:w="3360"/>
+          </w:tcPr>
+          <w:p>
+            <w:r/>
+            <w:r>
+              <w:rPr>
+                <w:b w:val="0"/>
+                <w:sz w:val="17"/>
+              </w:rPr>
+              <w:t>Create 3 groups + link 8 rules (idempotent UPDATE-then-INSERT)</w:t>
+            </w:r>
+          </w:p>
+        </w:tc>
+        <w:tc>
+          <w:tcPr>
+            <w:tcW w:type="dxa" w:w="3360"/>
+            <w:shd w:val="clear" w:color="auto" w:fill="00B050"/>
+          </w:tcPr>
+          <w:p>
+            <w:pPr>
+              <w:jc w:val="center"/>
+            </w:pPr>
+            <w:r/>
+            <w:r>
+              <w:rPr>
+                <w:b/>
+                <w:color w:val="FFFFFF"/>
+                <w:sz w:val="18"/>
+              </w:rPr>
+              <w:t>PASS</w:t>
+            </w:r>
+          </w:p>
+        </w:tc>
+      </w:tr>
+    </w:tbl>
+    <w:p/>
+    <w:p>
+      <w:pPr>
+        <w:pStyle w:val="Heading2"/>
+      </w:pPr>
+      <w:r>
+        <w:t>8.2 Groups created (live on COPS DEV) + linked rules</w:t>
+      </w:r>
+    </w:p>
+    <w:tbl>
+      <w:tblPr>
+        <w:tblStyle w:val="TableGrid"/>
+        <w:tblW w:type="auto" w:w="0"/>
+        <w:tblLook w:firstColumn="1" w:firstRow="1" w:lastColumn="0" w:lastRow="0" w:noHBand="0" w:noVBand="1" w:val="04A0"/>
+      </w:tblPr>
+      <w:tblGrid>
+        <w:gridCol w:w="2520"/>
+        <w:gridCol w:w="2520"/>
+        <w:gridCol w:w="2520"/>
+        <w:gridCol w:w="2520"/>
+      </w:tblGrid>
+      <w:tr>
+        <w:tc>
+          <w:tcPr>
+            <w:tcW w:type="dxa" w:w="2520"/>
+            <w:shd w:val="clear" w:color="auto" w:fill="1F497D"/>
+          </w:tcPr>
+          <w:p>
+            <w:pPr>
+              <w:jc w:val="center"/>
+            </w:pPr>
+            <w:r/>
+            <w:r>
+              <w:rPr>
+                <w:b/>
+                <w:color w:val="FFFFFF"/>
+                <w:sz w:val="16"/>
+              </w:rPr>
+              <w:t>Check Group</w:t>
+            </w:r>
+          </w:p>
+        </w:tc>
+        <w:tc>
+          <w:tcPr>
+            <w:tcW w:type="dxa" w:w="2520"/>
+            <w:shd w:val="clear" w:color="auto" w:fill="1F497D"/>
+          </w:tcPr>
+          <w:p>
+            <w:pPr>
+              <w:jc w:val="center"/>
+            </w:pPr>
+            <w:r/>
+            <w:r>
+              <w:rPr>
+                <w:b/>
+                <w:color w:val="FFFFFF"/>
+                <w:sz w:val="16"/>
+              </w:rPr>
+              <w:t>CHECK_ID</w:t>
+            </w:r>
+          </w:p>
+        </w:tc>
+        <w:tc>
+          <w:tcPr>
+            <w:tcW w:type="dxa" w:w="2520"/>
+            <w:shd w:val="clear" w:color="auto" w:fill="1F497D"/>
+          </w:tcPr>
+          <w:p>
+            <w:pPr>
+              <w:jc w:val="center"/>
+            </w:pPr>
+            <w:r/>
+            <w:r>
+              <w:rPr>
+                <w:b/>
+                <w:color w:val="FFFFFF"/>
+                <w:sz w:val="16"/>
+              </w:rPr>
+              <w:t>Linked Rule</w:t>
+            </w:r>
+          </w:p>
+        </w:tc>
+        <w:tc>
+          <w:tcPr>
+            <w:tcW w:type="dxa" w:w="2520"/>
+            <w:shd w:val="clear" w:color="auto" w:fill="1F497D"/>
+          </w:tcPr>
+          <w:p>
+            <w:pPr>
+              <w:jc w:val="center"/>
+            </w:pPr>
+            <w:r/>
+            <w:r>
+              <w:rPr>
+                <w:b/>
+                <w:color w:val="FFFFFF"/>
+                <w:sz w:val="16"/>
+              </w:rPr>
+              <w:t>TABLE_ID</w:t>
+            </w:r>
+          </w:p>
+        </w:tc>
+      </w:tr>
+      <w:tr>
+        <w:tc>
+          <w:tcPr>
+            <w:tcW w:type="dxa" w:w="2520"/>
+            <w:shd w:val="clear" w:color="auto" w:fill="DDEBF7"/>
+          </w:tcPr>
+          <w:p>
+            <w:r/>
+            <w:r>
+              <w:rPr>
+                <w:b/>
+                <w:sz w:val="16"/>
+              </w:rPr>
+              <w:t>V_PHD_STREAM_ANALYSIS  (status P)</w:t>
+            </w:r>
+          </w:p>
+        </w:tc>
+        <w:tc>
+          <w:tcPr>
+            <w:tcW w:type="dxa" w:w="2520"/>
+            <w:shd w:val="clear" w:color="auto" w:fill="DDEBF7"/>
+          </w:tcPr>
+          <w:p>
+            <w:r/>
+            <w:r>
+              <w:rPr>
+                <w:b w:val="0"/>
+                <w:sz w:val="16"/>
+              </w:rPr>
+              <w:t>-</w:t>
+            </w:r>
+          </w:p>
+        </w:tc>
+        <w:tc>
+          <w:tcPr>
+            <w:tcW w:type="dxa" w:w="2520"/>
+            <w:shd w:val="clear" w:color="auto" w:fill="DDEBF7"/>
+          </w:tcPr>
+          <w:p>
+            <w:r/>
+            <w:r>
+              <w:rPr>
+                <w:b w:val="0"/>
+                <w:sz w:val="16"/>
+              </w:rPr>
+              <w:t>parent V_DAILY_PHD_VALIDATION  |  screen /com.ec.prod.po.screens/stream_gas_component_analysis/STRM_SET/PO.0020/COMP_SET/STRM_GAS_COMP?screentemplate=/com.ec.prod.po.screens/stream_gas_component_analysis</w:t>
+            </w:r>
+          </w:p>
+        </w:tc>
+        <w:tc>
+          <w:tcPr>
+            <w:tcW w:type="dxa" w:w="2520"/>
+            <w:shd w:val="clear" w:color="auto" w:fill="DDEBF7"/>
+          </w:tcPr>
+          <w:p>
+            <w:r/>
+            <w:r>
+              <w:rPr>
+                <w:b w:val="0"/>
+                <w:sz w:val="16"/>
+              </w:rPr>
+              <w:t>-</w:t>
+            </w:r>
+          </w:p>
+        </w:tc>
+      </w:tr>
+      <w:tr>
+        <w:tc>
+          <w:tcPr>
+            <w:tcW w:type="dxa" w:w="2520"/>
+            <w:shd w:val="clear" w:color="auto" w:fill="F2F2F2"/>
+          </w:tcPr>
+          <w:p>
+            <w:r/>
+            <w:r>
+              <w:rPr>
+                <w:b w:val="0"/>
+                <w:sz w:val="16"/>
+              </w:rPr>
+              <w:t>-</w:t>
+            </w:r>
+          </w:p>
+        </w:tc>
+        <w:tc>
+          <w:tcPr>
+            <w:tcW w:type="dxa" w:w="2520"/>
+            <w:shd w:val="clear" w:color="auto" w:fill="F2F2F2"/>
+          </w:tcPr>
+          <w:p>
+            <w:pPr>
+              <w:jc w:val="center"/>
+            </w:pPr>
+            <w:r/>
+            <w:r>
+              <w:rPr>
+                <w:b w:val="0"/>
+                <w:sz w:val="16"/>
+              </w:rPr>
+              <w:t>1144</w:t>
+            </w:r>
+          </w:p>
+        </w:tc>
+        <w:tc>
+          <w:tcPr>
+            <w:tcW w:type="dxa" w:w="2520"/>
+            <w:shd w:val="clear" w:color="auto" w:fill="F2F2F2"/>
+          </w:tcPr>
+          <w:p>
+            <w:r/>
+            <w:r>
+              <w:rPr>
+                <w:b w:val="0"/>
+                <w:sz w:val="16"/>
+              </w:rPr>
+              <w:t>PHD_STRM_ANALYSIS_DENSITY_VAL1</w:t>
+            </w:r>
+          </w:p>
+        </w:tc>
+        <w:tc>
+          <w:tcPr>
+            <w:tcW w:type="dxa" w:w="2520"/>
+            <w:shd w:val="clear" w:color="auto" w:fill="F2F2F2"/>
+          </w:tcPr>
+          <w:p>
+            <w:r/>
+            <w:r>
+              <w:rPr>
+                <w:b w:val="0"/>
+                <w:sz w:val="16"/>
+              </w:rPr>
+              <w:t>RV_STRM_ANALYSIS</w:t>
+            </w:r>
+          </w:p>
+        </w:tc>
+      </w:tr>
+      <w:tr>
+        <w:tc>
+          <w:tcPr>
+            <w:tcW w:type="dxa" w:w="2520"/>
+            <w:shd w:val="clear" w:color="auto" w:fill="FFFFFF"/>
+          </w:tcPr>
+          <w:p>
+            <w:r/>
+            <w:r>
+              <w:rPr>
+                <w:b w:val="0"/>
+                <w:sz w:val="16"/>
+              </w:rPr>
+              <w:t>-</w:t>
+            </w:r>
+          </w:p>
+        </w:tc>
+        <w:tc>
+          <w:tcPr>
+            <w:tcW w:type="dxa" w:w="2520"/>
+            <w:shd w:val="clear" w:color="auto" w:fill="FFFFFF"/>
+          </w:tcPr>
+          <w:p>
+            <w:pPr>
+              <w:jc w:val="center"/>
+            </w:pPr>
+            <w:r/>
+            <w:r>
+              <w:rPr>
+                <w:b w:val="0"/>
+                <w:sz w:val="16"/>
+              </w:rPr>
+              <w:t>1145</w:t>
+            </w:r>
+          </w:p>
+        </w:tc>
+        <w:tc>
+          <w:tcPr>
+            <w:tcW w:type="dxa" w:w="2520"/>
+            <w:shd w:val="clear" w:color="auto" w:fill="FFFFFF"/>
+          </w:tcPr>
+          <w:p>
+            <w:r/>
+            <w:r>
+              <w:rPr>
+                <w:b w:val="0"/>
+                <w:sz w:val="16"/>
+              </w:rPr>
+              <w:t>PHD_STRM_ANALYSIS_GCV_VAL1</w:t>
+            </w:r>
+          </w:p>
+        </w:tc>
+        <w:tc>
+          <w:tcPr>
+            <w:tcW w:type="dxa" w:w="2520"/>
+            <w:shd w:val="clear" w:color="auto" w:fill="FFFFFF"/>
+          </w:tcPr>
+          <w:p>
+            <w:r/>
+            <w:r>
+              <w:rPr>
+                <w:b w:val="0"/>
+                <w:sz w:val="16"/>
+              </w:rPr>
+              <w:t>RV_STRM_ANALYSIS</w:t>
+            </w:r>
+          </w:p>
+        </w:tc>
+      </w:tr>
+      <w:tr>
+        <w:tc>
+          <w:tcPr>
+            <w:tcW w:type="dxa" w:w="2520"/>
+            <w:shd w:val="clear" w:color="auto" w:fill="DDEBF7"/>
+          </w:tcPr>
+          <w:p>
+            <w:r/>
+            <w:r>
+              <w:rPr>
+                <w:b/>
+                <w:sz w:val="16"/>
+              </w:rPr>
+              <w:t>V_PHD_STREAM_COMP  (status P)</w:t>
+            </w:r>
+          </w:p>
+        </w:tc>
+        <w:tc>
+          <w:tcPr>
+            <w:tcW w:type="dxa" w:w="2520"/>
+            <w:shd w:val="clear" w:color="auto" w:fill="DDEBF7"/>
+          </w:tcPr>
+          <w:p>
+            <w:r/>
+            <w:r>
+              <w:rPr>
+                <w:b w:val="0"/>
+                <w:sz w:val="16"/>
+              </w:rPr>
+              <w:t>-</w:t>
+            </w:r>
+          </w:p>
+        </w:tc>
+        <w:tc>
+          <w:tcPr>
+            <w:tcW w:type="dxa" w:w="2520"/>
+            <w:shd w:val="clear" w:color="auto" w:fill="DDEBF7"/>
+          </w:tcPr>
+          <w:p>
+            <w:r/>
+            <w:r>
+              <w:rPr>
+                <w:b w:val="0"/>
+                <w:sz w:val="16"/>
+              </w:rPr>
+              <w:t>parent V_DAILY_PHD_VALIDATION  |  screen /com.ec.prod.po.screens/stream_gas_component_analysis/STRM_SET/PO.0020/COMP_SET/STRM_GAS_COMP?screentemplate=/com.ec.prod.po.screens/stream_gas_component_analysis</w:t>
+            </w:r>
+          </w:p>
+        </w:tc>
+        <w:tc>
+          <w:tcPr>
+            <w:tcW w:type="dxa" w:w="2520"/>
+            <w:shd w:val="clear" w:color="auto" w:fill="DDEBF7"/>
+          </w:tcPr>
+          <w:p>
+            <w:r/>
+            <w:r>
+              <w:rPr>
+                <w:b w:val="0"/>
+                <w:sz w:val="16"/>
+              </w:rPr>
+              <w:t>-</w:t>
+            </w:r>
+          </w:p>
+        </w:tc>
+      </w:tr>
+      <w:tr>
+        <w:tc>
+          <w:tcPr>
+            <w:tcW w:type="dxa" w:w="2520"/>
+            <w:shd w:val="clear" w:color="auto" w:fill="FFFFFF"/>
+          </w:tcPr>
+          <w:p>
+            <w:r/>
+            <w:r>
+              <w:rPr>
+                <w:b w:val="0"/>
+                <w:sz w:val="16"/>
+              </w:rPr>
+              <w:t>-</w:t>
+            </w:r>
+          </w:p>
+        </w:tc>
+        <w:tc>
+          <w:tcPr>
+            <w:tcW w:type="dxa" w:w="2520"/>
+            <w:shd w:val="clear" w:color="auto" w:fill="FFFFFF"/>
+          </w:tcPr>
+          <w:p>
+            <w:pPr>
+              <w:jc w:val="center"/>
+            </w:pPr>
+            <w:r/>
+            <w:r>
+              <w:rPr>
+                <w:b w:val="0"/>
+                <w:sz w:val="16"/>
+              </w:rPr>
+              <w:t>1142</w:t>
+            </w:r>
+          </w:p>
+        </w:tc>
+        <w:tc>
+          <w:tcPr>
+            <w:tcW w:type="dxa" w:w="2520"/>
+            <w:shd w:val="clear" w:color="auto" w:fill="FFFFFF"/>
+          </w:tcPr>
+          <w:p>
+            <w:r/>
+            <w:r>
+              <w:rPr>
+                <w:b w:val="0"/>
+                <w:sz w:val="16"/>
+              </w:rPr>
+              <w:t>PHD_STRM_COMP_MOL_PCT_VAL1</w:t>
+            </w:r>
+          </w:p>
+        </w:tc>
+        <w:tc>
+          <w:tcPr>
+            <w:tcW w:type="dxa" w:w="2520"/>
+            <w:shd w:val="clear" w:color="auto" w:fill="FFFFFF"/>
+          </w:tcPr>
+          <w:p>
+            <w:r/>
+            <w:r>
+              <w:rPr>
+                <w:b w:val="0"/>
+                <w:sz w:val="16"/>
+              </w:rPr>
+              <w:t>RV_STRM_COMP_ANALYSIS</w:t>
+            </w:r>
+          </w:p>
+        </w:tc>
+      </w:tr>
+      <w:tr>
+        <w:tc>
+          <w:tcPr>
+            <w:tcW w:type="dxa" w:w="2520"/>
+            <w:shd w:val="clear" w:color="auto" w:fill="F2F2F2"/>
+          </w:tcPr>
+          <w:p>
+            <w:r/>
+            <w:r>
+              <w:rPr>
+                <w:b w:val="0"/>
+                <w:sz w:val="16"/>
+              </w:rPr>
+              <w:t>-</w:t>
+            </w:r>
+          </w:p>
+        </w:tc>
+        <w:tc>
+          <w:tcPr>
+            <w:tcW w:type="dxa" w:w="2520"/>
+            <w:shd w:val="clear" w:color="auto" w:fill="F2F2F2"/>
+          </w:tcPr>
+          <w:p>
+            <w:pPr>
+              <w:jc w:val="center"/>
+            </w:pPr>
+            <w:r/>
+            <w:r>
+              <w:rPr>
+                <w:b w:val="0"/>
+                <w:sz w:val="16"/>
+              </w:rPr>
+              <w:t>1143</w:t>
+            </w:r>
+          </w:p>
+        </w:tc>
+        <w:tc>
+          <w:tcPr>
+            <w:tcW w:type="dxa" w:w="2520"/>
+            <w:shd w:val="clear" w:color="auto" w:fill="F2F2F2"/>
+          </w:tcPr>
+          <w:p>
+            <w:r/>
+            <w:r>
+              <w:rPr>
+                <w:b w:val="0"/>
+                <w:sz w:val="16"/>
+              </w:rPr>
+              <w:t>PHD_STRM_COMP_WT_PCT_VAL1</w:t>
+            </w:r>
+          </w:p>
+        </w:tc>
+        <w:tc>
+          <w:tcPr>
+            <w:tcW w:type="dxa" w:w="2520"/>
+            <w:shd w:val="clear" w:color="auto" w:fill="F2F2F2"/>
+          </w:tcPr>
+          <w:p>
+            <w:r/>
+            <w:r>
+              <w:rPr>
+                <w:b w:val="0"/>
+                <w:sz w:val="16"/>
+              </w:rPr>
+              <w:t>RV_STRM_COMP_ANALYSIS</w:t>
+            </w:r>
+          </w:p>
+        </w:tc>
+      </w:tr>
+      <w:tr>
+        <w:tc>
+          <w:tcPr>
+            <w:tcW w:type="dxa" w:w="2520"/>
+            <w:shd w:val="clear" w:color="auto" w:fill="DDEBF7"/>
+          </w:tcPr>
+          <w:p>
+            <w:r/>
+            <w:r>
+              <w:rPr>
+                <w:b/>
+                <w:sz w:val="16"/>
+              </w:rPr>
+              <w:t>V_PHD_TANK_DIP  (status P)</w:t>
+            </w:r>
+          </w:p>
+        </w:tc>
+        <w:tc>
+          <w:tcPr>
+            <w:tcW w:type="dxa" w:w="2520"/>
+            <w:shd w:val="clear" w:color="auto" w:fill="DDEBF7"/>
+          </w:tcPr>
+          <w:p>
+            <w:r/>
+            <w:r>
+              <w:rPr>
+                <w:b w:val="0"/>
+                <w:sz w:val="16"/>
+              </w:rPr>
+              <w:t>-</w:t>
+            </w:r>
+          </w:p>
+        </w:tc>
+        <w:tc>
+          <w:tcPr>
+            <w:tcW w:type="dxa" w:w="2520"/>
+            <w:shd w:val="clear" w:color="auto" w:fill="DDEBF7"/>
+          </w:tcPr>
+          <w:p>
+            <w:r/>
+            <w:r>
+              <w:rPr>
+                <w:b w:val="0"/>
+                <w:sz w:val="16"/>
+              </w:rPr>
+              <w:t>parent V_DAILY_PHD_VALIDATION  |  screen /com.ec.prod.po.screens/daily_tank_dip_status</w:t>
+            </w:r>
+          </w:p>
+        </w:tc>
+        <w:tc>
+          <w:tcPr>
+            <w:tcW w:type="dxa" w:w="2520"/>
+            <w:shd w:val="clear" w:color="auto" w:fill="DDEBF7"/>
+          </w:tcPr>
+          <w:p>
+            <w:r/>
+            <w:r>
+              <w:rPr>
+                <w:b w:val="0"/>
+                <w:sz w:val="16"/>
+              </w:rPr>
+              <w:t>-</w:t>
+            </w:r>
+          </w:p>
+        </w:tc>
+      </w:tr>
+      <w:tr>
+        <w:tc>
+          <w:tcPr>
+            <w:tcW w:type="dxa" w:w="2520"/>
+            <w:shd w:val="clear" w:color="auto" w:fill="F2F2F2"/>
+          </w:tcPr>
+          <w:p>
+            <w:r/>
+            <w:r>
+              <w:rPr>
+                <w:b w:val="0"/>
+                <w:sz w:val="16"/>
+              </w:rPr>
+              <w:t>-</w:t>
+            </w:r>
+          </w:p>
+        </w:tc>
+        <w:tc>
+          <w:tcPr>
+            <w:tcW w:type="dxa" w:w="2520"/>
+            <w:shd w:val="clear" w:color="auto" w:fill="F2F2F2"/>
+          </w:tcPr>
+          <w:p>
+            <w:pPr>
+              <w:jc w:val="center"/>
+            </w:pPr>
+            <w:r/>
+            <w:r>
+              <w:rPr>
+                <w:b w:val="0"/>
+                <w:sz w:val="16"/>
+              </w:rPr>
+              <w:t>1146</w:t>
+            </w:r>
+          </w:p>
+        </w:tc>
+        <w:tc>
+          <w:tcPr>
+            <w:tcW w:type="dxa" w:w="2520"/>
+            <w:shd w:val="clear" w:color="auto" w:fill="F2F2F2"/>
+          </w:tcPr>
+          <w:p>
+            <w:r/>
+            <w:r>
+              <w:rPr>
+                <w:b w:val="0"/>
+                <w:sz w:val="16"/>
+              </w:rPr>
+              <w:t>PHD_TANK_DIP_GRS_VOL_VAL1</w:t>
+            </w:r>
+          </w:p>
+        </w:tc>
+        <w:tc>
+          <w:tcPr>
+            <w:tcW w:type="dxa" w:w="2520"/>
+            <w:shd w:val="clear" w:color="auto" w:fill="F2F2F2"/>
+          </w:tcPr>
+          <w:p>
+            <w:r/>
+            <w:r>
+              <w:rPr>
+                <w:b w:val="0"/>
+                <w:sz w:val="16"/>
+              </w:rPr>
+              <w:t>RV_TANK_DAY_DIP_STATUS</w:t>
+            </w:r>
+          </w:p>
+        </w:tc>
+      </w:tr>
+      <w:tr>
+        <w:tc>
+          <w:tcPr>
+            <w:tcW w:type="dxa" w:w="2520"/>
+            <w:shd w:val="clear" w:color="auto" w:fill="FFFFFF"/>
+          </w:tcPr>
+          <w:p>
+            <w:r/>
+            <w:r>
+              <w:rPr>
+                <w:b w:val="0"/>
+                <w:sz w:val="16"/>
+              </w:rPr>
+              <w:t>-</w:t>
+            </w:r>
+          </w:p>
+        </w:tc>
+        <w:tc>
+          <w:tcPr>
+            <w:tcW w:type="dxa" w:w="2520"/>
+            <w:shd w:val="clear" w:color="auto" w:fill="FFFFFF"/>
+          </w:tcPr>
+          <w:p>
+            <w:pPr>
+              <w:jc w:val="center"/>
+            </w:pPr>
+            <w:r/>
+            <w:r>
+              <w:rPr>
+                <w:b w:val="0"/>
+                <w:sz w:val="16"/>
+              </w:rPr>
+              <w:t>1147</w:t>
+            </w:r>
+          </w:p>
+        </w:tc>
+        <w:tc>
+          <w:tcPr>
+            <w:tcW w:type="dxa" w:w="2520"/>
+            <w:shd w:val="clear" w:color="auto" w:fill="FFFFFF"/>
+          </w:tcPr>
+          <w:p>
+            <w:r/>
+            <w:r>
+              <w:rPr>
+                <w:b w:val="0"/>
+                <w:sz w:val="16"/>
+              </w:rPr>
+              <w:t>PHD_TANK_DIP_GRS_MASS_VAL1</w:t>
+            </w:r>
+          </w:p>
+        </w:tc>
+        <w:tc>
+          <w:tcPr>
+            <w:tcW w:type="dxa" w:w="2520"/>
+            <w:shd w:val="clear" w:color="auto" w:fill="FFFFFF"/>
+          </w:tcPr>
+          <w:p>
+            <w:r/>
+            <w:r>
+              <w:rPr>
+                <w:b w:val="0"/>
+                <w:sz w:val="16"/>
+              </w:rPr>
+              <w:t>RV_TANK_DAY_DIP_STATUS</w:t>
+            </w:r>
+          </w:p>
+        </w:tc>
+      </w:tr>
+      <w:tr>
+        <w:tc>
+          <w:tcPr>
+            <w:tcW w:type="dxa" w:w="2520"/>
+            <w:shd w:val="clear" w:color="auto" w:fill="F2F2F2"/>
+          </w:tcPr>
+          <w:p>
+            <w:r/>
+            <w:r>
+              <w:rPr>
+                <w:b w:val="0"/>
+                <w:sz w:val="16"/>
+              </w:rPr>
+              <w:t>-</w:t>
+            </w:r>
+          </w:p>
+        </w:tc>
+        <w:tc>
+          <w:tcPr>
+            <w:tcW w:type="dxa" w:w="2520"/>
+            <w:shd w:val="clear" w:color="auto" w:fill="F2F2F2"/>
+          </w:tcPr>
+          <w:p>
+            <w:pPr>
+              <w:jc w:val="center"/>
+            </w:pPr>
+            <w:r/>
+            <w:r>
+              <w:rPr>
+                <w:b w:val="0"/>
+                <w:sz w:val="16"/>
+              </w:rPr>
+              <w:t>1148</w:t>
+            </w:r>
+          </w:p>
+        </w:tc>
+        <w:tc>
+          <w:tcPr>
+            <w:tcW w:type="dxa" w:w="2520"/>
+            <w:shd w:val="clear" w:color="auto" w:fill="F2F2F2"/>
+          </w:tcPr>
+          <w:p>
+            <w:r/>
+            <w:r>
+              <w:rPr>
+                <w:b w:val="0"/>
+                <w:sz w:val="16"/>
+              </w:rPr>
+              <w:t>PHD_TANK_DIP_AVG_TEMP_VAL1</w:t>
+            </w:r>
+          </w:p>
+        </w:tc>
+        <w:tc>
+          <w:tcPr>
+            <w:tcW w:type="dxa" w:w="2520"/>
+            <w:shd w:val="clear" w:color="auto" w:fill="F2F2F2"/>
+          </w:tcPr>
+          <w:p>
+            <w:r/>
+            <w:r>
+              <w:rPr>
+                <w:b w:val="0"/>
+                <w:sz w:val="16"/>
+              </w:rPr>
+              <w:t>RV_TANK_DAY_DIP_STATUS</w:t>
+            </w:r>
+          </w:p>
+        </w:tc>
+      </w:tr>
+      <w:tr>
+        <w:tc>
+          <w:tcPr>
+            <w:tcW w:type="dxa" w:w="2520"/>
+            <w:shd w:val="clear" w:color="auto" w:fill="FFFFFF"/>
+          </w:tcPr>
+          <w:p>
+            <w:r/>
+            <w:r>
+              <w:rPr>
+                <w:b w:val="0"/>
+                <w:sz w:val="16"/>
+              </w:rPr>
+              <w:t>-</w:t>
+            </w:r>
+          </w:p>
+        </w:tc>
+        <w:tc>
+          <w:tcPr>
+            <w:tcW w:type="dxa" w:w="2520"/>
+            <w:shd w:val="clear" w:color="auto" w:fill="FFFFFF"/>
+          </w:tcPr>
+          <w:p>
+            <w:pPr>
+              <w:jc w:val="center"/>
+            </w:pPr>
+            <w:r/>
+            <w:r>
+              <w:rPr>
+                <w:b w:val="0"/>
+                <w:sz w:val="16"/>
+              </w:rPr>
+              <w:t>1149</w:t>
+            </w:r>
+          </w:p>
+        </w:tc>
+        <w:tc>
+          <w:tcPr>
+            <w:tcW w:type="dxa" w:w="2520"/>
+            <w:shd w:val="clear" w:color="auto" w:fill="FFFFFF"/>
+          </w:tcPr>
+          <w:p>
+            <w:r/>
+            <w:r>
+              <w:rPr>
+                <w:b w:val="0"/>
+                <w:sz w:val="16"/>
+              </w:rPr>
+              <w:t>PHD_TANK_DIP_STD_DENSITY_VAL1</w:t>
+            </w:r>
+          </w:p>
+        </w:tc>
+        <w:tc>
+          <w:tcPr>
+            <w:tcW w:type="dxa" w:w="2520"/>
+            <w:shd w:val="clear" w:color="auto" w:fill="FFFFFF"/>
+          </w:tcPr>
+          <w:p>
+            <w:r/>
+            <w:r>
+              <w:rPr>
+                <w:b w:val="0"/>
+                <w:sz w:val="16"/>
+              </w:rPr>
+              <w:t>RV_TANK_DAY_DIP_STATUS</w:t>
+            </w:r>
+          </w:p>
+        </w:tc>
+      </w:tr>
+    </w:tbl>
+    <w:p/>
+    <w:p>
+      <w:pPr>
+        <w:pStyle w:val="Heading2"/>
+      </w:pPr>
+      <w:r>
+        <w:t>8.3 Lifecycle test (COPS DEV)</w:t>
+      </w:r>
+    </w:p>
+    <w:tbl>
+      <w:tblPr>
+        <w:tblStyle w:val="TableGrid"/>
+        <w:tblW w:type="auto" w:w="0"/>
+        <w:tblLook w:firstColumn="1" w:firstRow="1" w:lastColumn="0" w:lastRow="0" w:noHBand="0" w:noVBand="1" w:val="04A0"/>
+      </w:tblPr>
+      <w:tblGrid>
+        <w:gridCol w:w="3360"/>
+        <w:gridCol w:w="3360"/>
+        <w:gridCol w:w="3360"/>
+      </w:tblGrid>
+      <w:tr>
+        <w:tc>
+          <w:tcPr>
+            <w:tcW w:type="dxa" w:w="3360"/>
+            <w:shd w:val="clear" w:color="auto" w:fill="1F497D"/>
+          </w:tcPr>
+          <w:p>
+            <w:pPr>
+              <w:jc w:val="center"/>
+            </w:pPr>
+            <w:r/>
+            <w:r>
+              <w:rPr>
+                <w:b/>
+                <w:color w:val="FFFFFF"/>
+                <w:sz w:val="18"/>
+              </w:rPr>
+              <w:t>Step</w:t>
+            </w:r>
+          </w:p>
+        </w:tc>
+        <w:tc>
+          <w:tcPr>
+            <w:tcW w:type="dxa" w:w="3360"/>
+            <w:shd w:val="clear" w:color="auto" w:fill="1F497D"/>
+          </w:tcPr>
+          <w:p>
+            <w:pPr>
+              <w:jc w:val="center"/>
+            </w:pPr>
+            <w:r/>
+            <w:r>
+              <w:rPr>
+                <w:b/>
+                <w:color w:val="FFFFFF"/>
+                <w:sz w:val="18"/>
+              </w:rPr>
+              <w:t>Result</w:t>
+            </w:r>
+          </w:p>
+        </w:tc>
+        <w:tc>
+          <w:tcPr>
+            <w:tcW w:type="dxa" w:w="3360"/>
+            <w:shd w:val="clear" w:color="auto" w:fill="1F497D"/>
+          </w:tcPr>
+          <w:p>
+            <w:pPr>
+              <w:jc w:val="center"/>
+            </w:pPr>
+            <w:r/>
+            <w:r>
+              <w:rPr>
+                <w:b/>
+                <w:color w:val="FFFFFF"/>
+                <w:sz w:val="18"/>
+              </w:rPr>
+              <w:t>Status</w:t>
+            </w:r>
+          </w:p>
+        </w:tc>
+      </w:tr>
+      <w:tr>
+        <w:tc>
+          <w:tcPr>
+            <w:tcW w:type="dxa" w:w="3360"/>
+            <w:shd w:val="clear" w:color="auto" w:fill="FFFFFF"/>
+          </w:tcPr>
+          <w:p>
+            <w:r/>
+            <w:r>
+              <w:rPr>
+                <w:b w:val="0"/>
+                <w:sz w:val="17"/>
+              </w:rPr>
+              <w:t>Deploy</w:t>
+            </w:r>
+          </w:p>
+        </w:tc>
+        <w:tc>
+          <w:tcPr>
+            <w:tcW w:type="dxa" w:w="3360"/>
+            <w:shd w:val="clear" w:color="auto" w:fill="FFFFFF"/>
+          </w:tcPr>
+          <w:p>
+            <w:r/>
+            <w:r>
+              <w:rPr>
+                <w:b w:val="0"/>
+                <w:sz w:val="17"/>
+              </w:rPr>
+              <w:t>3 groups, 8 links</w:t>
+            </w:r>
+          </w:p>
+        </w:tc>
+        <w:tc>
+          <w:tcPr>
+            <w:tcW w:type="dxa" w:w="3360"/>
+            <w:shd w:val="clear" w:color="auto" w:fill="00B050"/>
+          </w:tcPr>
+          <w:p>
+            <w:pPr>
+              <w:jc w:val="center"/>
+            </w:pPr>
+            <w:r/>
+            <w:r>
+              <w:rPr>
+                <w:b/>
+                <w:color w:val="FFFFFF"/>
+                <w:sz w:val="18"/>
+              </w:rPr>
+              <w:t>PASS</w:t>
+            </w:r>
+          </w:p>
+        </w:tc>
+      </w:tr>
+      <w:tr>
+        <w:tc>
+          <w:tcPr>
+            <w:tcW w:type="dxa" w:w="3360"/>
+            <w:shd w:val="clear" w:color="auto" w:fill="F2F2F2"/>
+          </w:tcPr>
+          <w:p>
+            <w:r/>
+            <w:r>
+              <w:rPr>
+                <w:b w:val="0"/>
+                <w:sz w:val="17"/>
+              </w:rPr>
+              <w:t>Deploy again (idempotency)</w:t>
+            </w:r>
+          </w:p>
+        </w:tc>
+        <w:tc>
+          <w:tcPr>
+            <w:tcW w:type="dxa" w:w="3360"/>
+            <w:shd w:val="clear" w:color="auto" w:fill="F2F2F2"/>
+          </w:tcPr>
+          <w:p>
+            <w:r/>
+            <w:r>
+              <w:rPr>
+                <w:b w:val="0"/>
+                <w:sz w:val="17"/>
+              </w:rPr>
+              <w:t>still 3 groups, 8 links — no duplicates</w:t>
+            </w:r>
+          </w:p>
+        </w:tc>
+        <w:tc>
+          <w:tcPr>
+            <w:tcW w:type="dxa" w:w="3360"/>
+            <w:shd w:val="clear" w:color="auto" w:fill="00B050"/>
+          </w:tcPr>
+          <w:p>
+            <w:pPr>
+              <w:jc w:val="center"/>
+            </w:pPr>
+            <w:r/>
+            <w:r>
+              <w:rPr>
+                <w:b/>
+                <w:color w:val="FFFFFF"/>
+                <w:sz w:val="18"/>
+              </w:rPr>
+              <w:t>PASS</w:t>
+            </w:r>
+          </w:p>
+        </w:tc>
+      </w:tr>
+    </w:tbl>
+    <w:p/>
+    <w:p>
+      <w:pPr>
+        <w:pStyle w:val="Heading1"/>
+      </w:pPr>
+      <w:r>
+        <w:t>9. Phase 2 — RF UI Test (Validation Overview)</w:t>
+      </w:r>
+    </w:p>
+    <w:p>
+      <w:r>
+        <w:rPr>
+          <w:sz w:val="20"/>
+        </w:rPr>
+        <w:t>A Robot Framework UI test drives the "Validation Overview - Pluto Scarborough" screen to RUN the 3 check groups on 2026-05-26, then verifies EC’s result against an INDEPENDENT per-object oracle computed from the source views using each rule’s own deployed WHERE_FORMULA. EC logs one violation per OBJECT (e.g. per stream), so the oracle counts DISTINCT OBJECT_ID. Files: tests/Configuration/System/Validation/validation_overview_pluto_scarborough.robot (+ page object).</w:t>
+      </w:r>
+    </w:p>
+    <w:p>
+      <w:pPr>
+        <w:pStyle w:val="Heading2"/>
+      </w:pPr>
+      <w:r>
+        <w:t>9.1 EC result vs independent DB oracle (2026-05-26)</w:t>
+      </w:r>
+    </w:p>
+    <w:tbl>
+      <w:tblPr>
+        <w:tblStyle w:val="TableGrid"/>
+        <w:tblW w:type="auto" w:w="0"/>
+        <w:tblLook w:firstColumn="1" w:firstRow="1" w:lastColumn="0" w:lastRow="0" w:noHBand="0" w:noVBand="1" w:val="04A0"/>
+      </w:tblPr>
+      <w:tblGrid>
+        <w:gridCol w:w="2016"/>
+        <w:gridCol w:w="2016"/>
+        <w:gridCol w:w="2016"/>
+        <w:gridCol w:w="2016"/>
+        <w:gridCol w:w="2016"/>
+      </w:tblGrid>
+      <w:tr>
+        <w:tc>
+          <w:tcPr>
+            <w:tcW w:type="dxa" w:w="2016"/>
+            <w:shd w:val="clear" w:color="auto" w:fill="1F497D"/>
+          </w:tcPr>
+          <w:p>
+            <w:pPr>
+              <w:jc w:val="center"/>
+            </w:pPr>
+            <w:r/>
+            <w:r>
+              <w:rPr>
+                <w:b/>
+                <w:color w:val="FFFFFF"/>
+                <w:sz w:val="16"/>
+              </w:rPr>
+              <w:t>CHECK_ID</w:t>
+            </w:r>
+          </w:p>
+        </w:tc>
+        <w:tc>
+          <w:tcPr>
+            <w:tcW w:type="dxa" w:w="2016"/>
+            <w:shd w:val="clear" w:color="auto" w:fill="1F497D"/>
+          </w:tcPr>
+          <w:p>
+            <w:pPr>
+              <w:jc w:val="center"/>
+            </w:pPr>
+            <w:r/>
+            <w:r>
+              <w:rPr>
+                <w:b/>
+                <w:color w:val="FFFFFF"/>
+                <w:sz w:val="16"/>
+              </w:rPr>
+              <w:t>Rule</w:t>
+            </w:r>
+          </w:p>
+        </w:tc>
+        <w:tc>
+          <w:tcPr>
+            <w:tcW w:type="dxa" w:w="2016"/>
+            <w:shd w:val="clear" w:color="auto" w:fill="1F497D"/>
+          </w:tcPr>
+          <w:p>
+            <w:pPr>
+              <w:jc w:val="center"/>
+            </w:pPr>
+            <w:r/>
+            <w:r>
+              <w:rPr>
+                <w:b/>
+                <w:color w:val="FFFFFF"/>
+                <w:sz w:val="16"/>
+              </w:rPr>
+              <w:t>DB oracle (distinct objects)</w:t>
+            </w:r>
+          </w:p>
+        </w:tc>
+        <w:tc>
+          <w:tcPr>
+            <w:tcW w:type="dxa" w:w="2016"/>
+            <w:shd w:val="clear" w:color="auto" w:fill="1F497D"/>
+          </w:tcPr>
+          <w:p>
+            <w:pPr>
+              <w:jc w:val="center"/>
+            </w:pPr>
+            <w:r/>
+            <w:r>
+              <w:rPr>
+                <w:b/>
+                <w:color w:val="FFFFFF"/>
+                <w:sz w:val="16"/>
+              </w:rPr>
+              <w:t>EC log (CTRL_CHECK_LOG)</w:t>
+            </w:r>
+          </w:p>
+        </w:tc>
+        <w:tc>
+          <w:tcPr>
+            <w:tcW w:type="dxa" w:w="2016"/>
+            <w:shd w:val="clear" w:color="auto" w:fill="1F497D"/>
+          </w:tcPr>
+          <w:p>
+            <w:pPr>
+              <w:jc w:val="center"/>
+            </w:pPr>
+            <w:r/>
+            <w:r>
+              <w:rPr>
+                <w:b/>
+                <w:color w:val="FFFFFF"/>
+                <w:sz w:val="16"/>
+              </w:rPr>
+              <w:t>Match</w:t>
+            </w:r>
+          </w:p>
+        </w:tc>
+      </w:tr>
+      <w:tr>
+        <w:tc>
+          <w:tcPr>
+            <w:tcW w:type="dxa" w:w="2016"/>
+            <w:shd w:val="clear" w:color="auto" w:fill="F2F2F2"/>
+          </w:tcPr>
+          <w:p>
+            <w:pPr>
+              <w:jc w:val="center"/>
+            </w:pPr>
+            <w:r/>
+            <w:r>
+              <w:rPr>
+                <w:b w:val="0"/>
+                <w:sz w:val="16"/>
+              </w:rPr>
+              <w:t>1142</w:t>
+            </w:r>
+          </w:p>
+        </w:tc>
+        <w:tc>
+          <w:tcPr>
+            <w:tcW w:type="dxa" w:w="2016"/>
+            <w:shd w:val="clear" w:color="auto" w:fill="F2F2F2"/>
+          </w:tcPr>
+          <w:p>
+            <w:r/>
+            <w:r>
+              <w:rPr>
+                <w:b w:val="0"/>
+                <w:sz w:val="16"/>
+              </w:rPr>
+              <w:t>PHD_STRM_COMP_MOL_PCT_VAL1</w:t>
+            </w:r>
+          </w:p>
+        </w:tc>
+        <w:tc>
+          <w:tcPr>
+            <w:tcW w:type="dxa" w:w="2016"/>
+            <w:shd w:val="clear" w:color="auto" w:fill="F2F2F2"/>
+          </w:tcPr>
+          <w:p>
+            <w:pPr>
+              <w:jc w:val="center"/>
+            </w:pPr>
+            <w:r/>
+            <w:r>
+              <w:rPr>
+                <w:b w:val="0"/>
+                <w:sz w:val="16"/>
+              </w:rPr>
+              <w:t>2</w:t>
+            </w:r>
+          </w:p>
+        </w:tc>
+        <w:tc>
+          <w:tcPr>
+            <w:tcW w:type="dxa" w:w="2016"/>
+            <w:shd w:val="clear" w:color="auto" w:fill="F2F2F2"/>
+          </w:tcPr>
+          <w:p>
+            <w:pPr>
+              <w:jc w:val="center"/>
+            </w:pPr>
+            <w:r/>
+            <w:r>
+              <w:rPr>
+                <w:b w:val="0"/>
+                <w:sz w:val="16"/>
+              </w:rPr>
+              <w:t>2</w:t>
+            </w:r>
+          </w:p>
+        </w:tc>
+        <w:tc>
+          <w:tcPr>
+            <w:tcW w:type="dxa" w:w="2016"/>
+            <w:shd w:val="clear" w:color="auto" w:fill="E2EFDA"/>
+          </w:tcPr>
+          <w:p>
+            <w:pPr>
+              <w:jc w:val="center"/>
+            </w:pPr>
+            <w:r/>
+            <w:r>
+              <w:rPr>
+                <w:b/>
+                <w:sz w:val="17"/>
+              </w:rPr>
+              <w:t>YES</w:t>
+            </w:r>
+          </w:p>
+        </w:tc>
+      </w:tr>
+      <w:tr>
+        <w:tc>
+          <w:tcPr>
+            <w:tcW w:type="dxa" w:w="2016"/>
+            <w:shd w:val="clear" w:color="auto" w:fill="FFFFFF"/>
+          </w:tcPr>
+          <w:p>
+            <w:pPr>
+              <w:jc w:val="center"/>
+            </w:pPr>
+            <w:r/>
+            <w:r>
+              <w:rPr>
+                <w:b w:val="0"/>
+                <w:sz w:val="16"/>
+              </w:rPr>
+              <w:t>1143</w:t>
+            </w:r>
+          </w:p>
+        </w:tc>
+        <w:tc>
+          <w:tcPr>
+            <w:tcW w:type="dxa" w:w="2016"/>
+            <w:shd w:val="clear" w:color="auto" w:fill="FFFFFF"/>
+          </w:tcPr>
+          <w:p>
+            <w:r/>
+            <w:r>
+              <w:rPr>
+                <w:b w:val="0"/>
+                <w:sz w:val="16"/>
+              </w:rPr>
+              <w:t>PHD_STRM_COMP_WT_PCT_VAL1</w:t>
+            </w:r>
+          </w:p>
+        </w:tc>
+        <w:tc>
+          <w:tcPr>
+            <w:tcW w:type="dxa" w:w="2016"/>
+            <w:shd w:val="clear" w:color="auto" w:fill="FFFFFF"/>
+          </w:tcPr>
+          <w:p>
+            <w:pPr>
+              <w:jc w:val="center"/>
+            </w:pPr>
+            <w:r/>
+            <w:r>
+              <w:rPr>
+                <w:b w:val="0"/>
+                <w:sz w:val="16"/>
+              </w:rPr>
+              <w:t>6</w:t>
+            </w:r>
+          </w:p>
+        </w:tc>
+        <w:tc>
+          <w:tcPr>
+            <w:tcW w:type="dxa" w:w="2016"/>
+            <w:shd w:val="clear" w:color="auto" w:fill="FFFFFF"/>
+          </w:tcPr>
+          <w:p>
+            <w:pPr>
+              <w:jc w:val="center"/>
+            </w:pPr>
+            <w:r/>
+            <w:r>
+              <w:rPr>
+                <w:b w:val="0"/>
+                <w:sz w:val="16"/>
+              </w:rPr>
+              <w:t>6</w:t>
+            </w:r>
+          </w:p>
+        </w:tc>
+        <w:tc>
+          <w:tcPr>
+            <w:tcW w:type="dxa" w:w="2016"/>
+            <w:shd w:val="clear" w:color="auto" w:fill="E2EFDA"/>
+          </w:tcPr>
+          <w:p>
+            <w:pPr>
+              <w:jc w:val="center"/>
+            </w:pPr>
+            <w:r/>
+            <w:r>
+              <w:rPr>
+                <w:b/>
+                <w:sz w:val="17"/>
+              </w:rPr>
+              <w:t>YES</w:t>
+            </w:r>
+          </w:p>
+        </w:tc>
+      </w:tr>
+      <w:tr>
+        <w:tc>
+          <w:tcPr>
+            <w:tcW w:type="dxa" w:w="2016"/>
+            <w:shd w:val="clear" w:color="auto" w:fill="F2F2F2"/>
+          </w:tcPr>
+          <w:p>
+            <w:pPr>
+              <w:jc w:val="center"/>
+            </w:pPr>
+            <w:r/>
+            <w:r>
+              <w:rPr>
+                <w:b w:val="0"/>
+                <w:sz w:val="16"/>
+              </w:rPr>
+              <w:t>1144</w:t>
+            </w:r>
+          </w:p>
+        </w:tc>
+        <w:tc>
+          <w:tcPr>
+            <w:tcW w:type="dxa" w:w="2016"/>
+            <w:shd w:val="clear" w:color="auto" w:fill="F2F2F2"/>
+          </w:tcPr>
+          <w:p>
+            <w:r/>
+            <w:r>
+              <w:rPr>
+                <w:b w:val="0"/>
+                <w:sz w:val="16"/>
+              </w:rPr>
+              <w:t>PHD_STRM_ANALYSIS_DENSITY_VAL1</w:t>
+            </w:r>
+          </w:p>
+        </w:tc>
+        <w:tc>
+          <w:tcPr>
+            <w:tcW w:type="dxa" w:w="2016"/>
+            <w:shd w:val="clear" w:color="auto" w:fill="F2F2F2"/>
+          </w:tcPr>
+          <w:p>
+            <w:pPr>
+              <w:jc w:val="center"/>
+            </w:pPr>
+            <w:r/>
+            <w:r>
+              <w:rPr>
+                <w:b w:val="0"/>
+                <w:sz w:val="16"/>
+              </w:rPr>
+              <w:t>8</w:t>
+            </w:r>
+          </w:p>
+        </w:tc>
+        <w:tc>
+          <w:tcPr>
+            <w:tcW w:type="dxa" w:w="2016"/>
+            <w:shd w:val="clear" w:color="auto" w:fill="F2F2F2"/>
+          </w:tcPr>
+          <w:p>
+            <w:pPr>
+              <w:jc w:val="center"/>
+            </w:pPr>
+            <w:r/>
+            <w:r>
+              <w:rPr>
+                <w:b w:val="0"/>
+                <w:sz w:val="16"/>
+              </w:rPr>
+              <w:t>8</w:t>
+            </w:r>
+          </w:p>
+        </w:tc>
+        <w:tc>
+          <w:tcPr>
+            <w:tcW w:type="dxa" w:w="2016"/>
+            <w:shd w:val="clear" w:color="auto" w:fill="E2EFDA"/>
+          </w:tcPr>
+          <w:p>
+            <w:pPr>
+              <w:jc w:val="center"/>
+            </w:pPr>
+            <w:r/>
+            <w:r>
+              <w:rPr>
+                <w:b/>
+                <w:sz w:val="17"/>
+              </w:rPr>
+              <w:t>YES</w:t>
+            </w:r>
+          </w:p>
+        </w:tc>
+      </w:tr>
+      <w:tr>
+        <w:tc>
+          <w:tcPr>
+            <w:tcW w:type="dxa" w:w="2016"/>
+            <w:shd w:val="clear" w:color="auto" w:fill="FFFFFF"/>
+          </w:tcPr>
+          <w:p>
+            <w:pPr>
+              <w:jc w:val="center"/>
+            </w:pPr>
+            <w:r/>
+            <w:r>
+              <w:rPr>
+                <w:b w:val="0"/>
+                <w:sz w:val="16"/>
+              </w:rPr>
+              <w:t>1145</w:t>
+            </w:r>
+          </w:p>
+        </w:tc>
+        <w:tc>
+          <w:tcPr>
+            <w:tcW w:type="dxa" w:w="2016"/>
+            <w:shd w:val="clear" w:color="auto" w:fill="FFFFFF"/>
+          </w:tcPr>
+          <w:p>
+            <w:r/>
+            <w:r>
+              <w:rPr>
+                <w:b w:val="0"/>
+                <w:sz w:val="16"/>
+              </w:rPr>
+              <w:t>PHD_STRM_ANALYSIS_GCV_VAL1</w:t>
+            </w:r>
+          </w:p>
+        </w:tc>
+        <w:tc>
+          <w:tcPr>
+            <w:tcW w:type="dxa" w:w="2016"/>
+            <w:shd w:val="clear" w:color="auto" w:fill="FFFFFF"/>
+          </w:tcPr>
+          <w:p>
+            <w:pPr>
+              <w:jc w:val="center"/>
+            </w:pPr>
+            <w:r/>
+            <w:r>
+              <w:rPr>
+                <w:b w:val="0"/>
+                <w:sz w:val="16"/>
+              </w:rPr>
+              <w:t>5</w:t>
+            </w:r>
+          </w:p>
+        </w:tc>
+        <w:tc>
+          <w:tcPr>
+            <w:tcW w:type="dxa" w:w="2016"/>
+            <w:shd w:val="clear" w:color="auto" w:fill="FFFFFF"/>
+          </w:tcPr>
+          <w:p>
+            <w:pPr>
+              <w:jc w:val="center"/>
+            </w:pPr>
+            <w:r/>
+            <w:r>
+              <w:rPr>
+                <w:b w:val="0"/>
+                <w:sz w:val="16"/>
+              </w:rPr>
+              <w:t>5</w:t>
+            </w:r>
+          </w:p>
+        </w:tc>
+        <w:tc>
+          <w:tcPr>
+            <w:tcW w:type="dxa" w:w="2016"/>
+            <w:shd w:val="clear" w:color="auto" w:fill="E2EFDA"/>
+          </w:tcPr>
+          <w:p>
+            <w:pPr>
+              <w:jc w:val="center"/>
+            </w:pPr>
+            <w:r/>
+            <w:r>
+              <w:rPr>
+                <w:b/>
+                <w:sz w:val="17"/>
+              </w:rPr>
+              <w:t>YES</w:t>
+            </w:r>
+          </w:p>
+        </w:tc>
+      </w:tr>
+      <w:tr>
+        <w:tc>
+          <w:tcPr>
+            <w:tcW w:type="dxa" w:w="2016"/>
+            <w:shd w:val="clear" w:color="auto" w:fill="F2F2F2"/>
+          </w:tcPr>
+          <w:p>
+            <w:pPr>
+              <w:jc w:val="center"/>
+            </w:pPr>
+            <w:r/>
+            <w:r>
+              <w:rPr>
+                <w:b w:val="0"/>
+                <w:sz w:val="16"/>
+              </w:rPr>
+              <w:t>1146</w:t>
+            </w:r>
+          </w:p>
+        </w:tc>
+        <w:tc>
+          <w:tcPr>
+            <w:tcW w:type="dxa" w:w="2016"/>
+            <w:shd w:val="clear" w:color="auto" w:fill="F2F2F2"/>
+          </w:tcPr>
+          <w:p>
+            <w:r/>
+            <w:r>
+              <w:rPr>
+                <w:b w:val="0"/>
+                <w:sz w:val="16"/>
+              </w:rPr>
+              <w:t>PHD_TANK_DIP_GRS_VOL_VAL1</w:t>
+            </w:r>
+          </w:p>
+        </w:tc>
+        <w:tc>
+          <w:tcPr>
+            <w:tcW w:type="dxa" w:w="2016"/>
+            <w:shd w:val="clear" w:color="auto" w:fill="F2F2F2"/>
+          </w:tcPr>
+          <w:p>
+            <w:pPr>
+              <w:jc w:val="center"/>
+            </w:pPr>
+            <w:r/>
+            <w:r>
+              <w:rPr>
+                <w:b w:val="0"/>
+                <w:sz w:val="16"/>
+              </w:rPr>
+              <w:t>0</w:t>
+            </w:r>
+          </w:p>
+        </w:tc>
+        <w:tc>
+          <w:tcPr>
+            <w:tcW w:type="dxa" w:w="2016"/>
+            <w:shd w:val="clear" w:color="auto" w:fill="F2F2F2"/>
+          </w:tcPr>
+          <w:p>
+            <w:pPr>
+              <w:jc w:val="center"/>
+            </w:pPr>
+            <w:r/>
+            <w:r>
+              <w:rPr>
+                <w:b w:val="0"/>
+                <w:sz w:val="16"/>
+              </w:rPr>
+              <w:t>0</w:t>
+            </w:r>
+          </w:p>
+        </w:tc>
+        <w:tc>
+          <w:tcPr>
+            <w:tcW w:type="dxa" w:w="2016"/>
+            <w:shd w:val="clear" w:color="auto" w:fill="E2EFDA"/>
+          </w:tcPr>
+          <w:p>
+            <w:pPr>
+              <w:jc w:val="center"/>
+            </w:pPr>
+            <w:r/>
+            <w:r>
+              <w:rPr>
+                <w:b/>
+                <w:sz w:val="17"/>
+              </w:rPr>
+              <w:t>YES</w:t>
+            </w:r>
+          </w:p>
+        </w:tc>
+      </w:tr>
+      <w:tr>
+        <w:tc>
+          <w:tcPr>
+            <w:tcW w:type="dxa" w:w="2016"/>
+            <w:shd w:val="clear" w:color="auto" w:fill="FFFFFF"/>
+          </w:tcPr>
+          <w:p>
+            <w:pPr>
+              <w:jc w:val="center"/>
+            </w:pPr>
+            <w:r/>
+            <w:r>
+              <w:rPr>
+                <w:b w:val="0"/>
+                <w:sz w:val="16"/>
+              </w:rPr>
+              <w:t>1147</w:t>
+            </w:r>
+          </w:p>
+        </w:tc>
+        <w:tc>
+          <w:tcPr>
+            <w:tcW w:type="dxa" w:w="2016"/>
+            <w:shd w:val="clear" w:color="auto" w:fill="FFFFFF"/>
+          </w:tcPr>
+          <w:p>
+            <w:r/>
+            <w:r>
+              <w:rPr>
+                <w:b w:val="0"/>
+                <w:sz w:val="16"/>
+              </w:rPr>
+              <w:t>PHD_TANK_DIP_GRS_MASS_VAL1</w:t>
+            </w:r>
+          </w:p>
+        </w:tc>
+        <w:tc>
+          <w:tcPr>
+            <w:tcW w:type="dxa" w:w="2016"/>
+            <w:shd w:val="clear" w:color="auto" w:fill="FFFFFF"/>
+          </w:tcPr>
+          <w:p>
+            <w:pPr>
+              <w:jc w:val="center"/>
+            </w:pPr>
+            <w:r/>
+            <w:r>
+              <w:rPr>
+                <w:b w:val="0"/>
+                <w:sz w:val="16"/>
+              </w:rPr>
+              <w:t>3</w:t>
+            </w:r>
+          </w:p>
+        </w:tc>
+        <w:tc>
+          <w:tcPr>
+            <w:tcW w:type="dxa" w:w="2016"/>
+            <w:shd w:val="clear" w:color="auto" w:fill="FFFFFF"/>
+          </w:tcPr>
+          <w:p>
+            <w:pPr>
+              <w:jc w:val="center"/>
+            </w:pPr>
+            <w:r/>
+            <w:r>
+              <w:rPr>
+                <w:b w:val="0"/>
+                <w:sz w:val="16"/>
+              </w:rPr>
+              <w:t>3</w:t>
+            </w:r>
+          </w:p>
+        </w:tc>
+        <w:tc>
+          <w:tcPr>
+            <w:tcW w:type="dxa" w:w="2016"/>
+            <w:shd w:val="clear" w:color="auto" w:fill="E2EFDA"/>
+          </w:tcPr>
+          <w:p>
+            <w:pPr>
+              <w:jc w:val="center"/>
+            </w:pPr>
+            <w:r/>
+            <w:r>
+              <w:rPr>
+                <w:b/>
+                <w:sz w:val="17"/>
+              </w:rPr>
+              <w:t>YES</w:t>
+            </w:r>
+          </w:p>
+        </w:tc>
+      </w:tr>
+      <w:tr>
+        <w:tc>
+          <w:tcPr>
+            <w:tcW w:type="dxa" w:w="2016"/>
+            <w:shd w:val="clear" w:color="auto" w:fill="F2F2F2"/>
+          </w:tcPr>
+          <w:p>
+            <w:pPr>
+              <w:jc w:val="center"/>
+            </w:pPr>
+            <w:r/>
+            <w:r>
+              <w:rPr>
+                <w:b w:val="0"/>
+                <w:sz w:val="16"/>
+              </w:rPr>
+              <w:t>1148</w:t>
+            </w:r>
+          </w:p>
+        </w:tc>
+        <w:tc>
+          <w:tcPr>
+            <w:tcW w:type="dxa" w:w="2016"/>
+            <w:shd w:val="clear" w:color="auto" w:fill="F2F2F2"/>
+          </w:tcPr>
+          <w:p>
+            <w:r/>
+            <w:r>
+              <w:rPr>
+                <w:b w:val="0"/>
+                <w:sz w:val="16"/>
+              </w:rPr>
+              <w:t>PHD_TANK_DIP_AVG_TEMP_VAL1</w:t>
+            </w:r>
+          </w:p>
+        </w:tc>
+        <w:tc>
+          <w:tcPr>
+            <w:tcW w:type="dxa" w:w="2016"/>
+            <w:shd w:val="clear" w:color="auto" w:fill="F2F2F2"/>
+          </w:tcPr>
+          <w:p>
+            <w:pPr>
+              <w:jc w:val="center"/>
+            </w:pPr>
+            <w:r/>
+            <w:r>
+              <w:rPr>
+                <w:b w:val="0"/>
+                <w:sz w:val="16"/>
+              </w:rPr>
+              <w:t>0</w:t>
+            </w:r>
+          </w:p>
+        </w:tc>
+        <w:tc>
+          <w:tcPr>
+            <w:tcW w:type="dxa" w:w="2016"/>
+            <w:shd w:val="clear" w:color="auto" w:fill="F2F2F2"/>
+          </w:tcPr>
+          <w:p>
+            <w:pPr>
+              <w:jc w:val="center"/>
+            </w:pPr>
+            <w:r/>
+            <w:r>
+              <w:rPr>
+                <w:b w:val="0"/>
+                <w:sz w:val="16"/>
+              </w:rPr>
+              <w:t>0</w:t>
+            </w:r>
+          </w:p>
+        </w:tc>
+        <w:tc>
+          <w:tcPr>
+            <w:tcW w:type="dxa" w:w="2016"/>
+            <w:shd w:val="clear" w:color="auto" w:fill="E2EFDA"/>
+          </w:tcPr>
+          <w:p>
+            <w:pPr>
+              <w:jc w:val="center"/>
+            </w:pPr>
+            <w:r/>
+            <w:r>
+              <w:rPr>
+                <w:b/>
+                <w:sz w:val="17"/>
+              </w:rPr>
+              <w:t>YES</w:t>
+            </w:r>
+          </w:p>
+        </w:tc>
+      </w:tr>
+      <w:tr>
+        <w:tc>
+          <w:tcPr>
+            <w:tcW w:type="dxa" w:w="2016"/>
+            <w:shd w:val="clear" w:color="auto" w:fill="FFFFFF"/>
+          </w:tcPr>
+          <w:p>
+            <w:pPr>
+              <w:jc w:val="center"/>
+            </w:pPr>
+            <w:r/>
+            <w:r>
+              <w:rPr>
+                <w:b w:val="0"/>
+                <w:sz w:val="16"/>
+              </w:rPr>
+              <w:t>1149</w:t>
+            </w:r>
+          </w:p>
+        </w:tc>
+        <w:tc>
+          <w:tcPr>
+            <w:tcW w:type="dxa" w:w="2016"/>
+            <w:shd w:val="clear" w:color="auto" w:fill="FFFFFF"/>
+          </w:tcPr>
+          <w:p>
+            <w:r/>
+            <w:r>
+              <w:rPr>
+                <w:b w:val="0"/>
+                <w:sz w:val="16"/>
+              </w:rPr>
+              <w:t>PHD_TANK_DIP_STD_DENSITY_VAL1</w:t>
+            </w:r>
+          </w:p>
+        </w:tc>
+        <w:tc>
+          <w:tcPr>
+            <w:tcW w:type="dxa" w:w="2016"/>
+            <w:shd w:val="clear" w:color="auto" w:fill="FFFFFF"/>
+          </w:tcPr>
+          <w:p>
+            <w:pPr>
+              <w:jc w:val="center"/>
+            </w:pPr>
+            <w:r/>
+            <w:r>
+              <w:rPr>
+                <w:b w:val="0"/>
+                <w:sz w:val="16"/>
+              </w:rPr>
+              <w:t>3</w:t>
+            </w:r>
+          </w:p>
+        </w:tc>
+        <w:tc>
+          <w:tcPr>
+            <w:tcW w:type="dxa" w:w="2016"/>
+            <w:shd w:val="clear" w:color="auto" w:fill="FFFFFF"/>
+          </w:tcPr>
+          <w:p>
+            <w:pPr>
+              <w:jc w:val="center"/>
+            </w:pPr>
+            <w:r/>
+            <w:r>
+              <w:rPr>
+                <w:b w:val="0"/>
+                <w:sz w:val="16"/>
+              </w:rPr>
+              <w:t>3</w:t>
+            </w:r>
+          </w:p>
+        </w:tc>
+        <w:tc>
+          <w:tcPr>
+            <w:tcW w:type="dxa" w:w="2016"/>
+            <w:shd w:val="clear" w:color="auto" w:fill="E2EFDA"/>
+          </w:tcPr>
+          <w:p>
+            <w:pPr>
+              <w:jc w:val="center"/>
+            </w:pPr>
+            <w:r/>
+            <w:r>
+              <w:rPr>
+                <w:b/>
+                <w:sz w:val="17"/>
+              </w:rPr>
+              <w:t>YES</w:t>
+            </w:r>
+          </w:p>
+        </w:tc>
+      </w:tr>
+    </w:tbl>
+    <w:p/>
+    <w:p>
+      <w:r>
+        <w:rPr>
+          <w:sz w:val="18"/>
+        </w:rPr>
+        <w:t>Group UI Summary "Errors" totals (front-end) matched the DB totals: Composition 8 (2+6), Analysis 13 (8+5), Tank 6 (0+3+0+3).</w:t>
+      </w:r>
+    </w:p>
+    <w:p>
+      <w:pPr>
+        <w:pStyle w:val="Heading2"/>
+      </w:pPr>
+      <w:r>
+        <w:t>9.2 RF run results (11/11 pass, headless on COPS DEV)</w:t>
+      </w:r>
+    </w:p>
+    <w:tbl>
+      <w:tblPr>
+        <w:tblStyle w:val="TableGrid"/>
+        <w:tblW w:type="auto" w:w="0"/>
+        <w:tblLook w:firstColumn="1" w:firstRow="1" w:lastColumn="0" w:lastRow="0" w:noHBand="0" w:noVBand="1" w:val="04A0"/>
+      </w:tblPr>
+      <w:tblGrid>
+        <w:gridCol w:w="5040"/>
+        <w:gridCol w:w="5040"/>
+      </w:tblGrid>
+      <w:tr>
+        <w:tc>
+          <w:tcPr>
+            <w:tcW w:type="dxa" w:w="5040"/>
+            <w:shd w:val="clear" w:color="auto" w:fill="1F497D"/>
+          </w:tcPr>
+          <w:p>
+            <w:pPr>
+              <w:jc w:val="center"/>
+            </w:pPr>
+            <w:r/>
+            <w:r>
+              <w:rPr>
+                <w:b/>
+                <w:color w:val="FFFFFF"/>
+                <w:sz w:val="18"/>
+              </w:rPr>
+              <w:t>Test Case</w:t>
+            </w:r>
+          </w:p>
+        </w:tc>
+        <w:tc>
+          <w:tcPr>
+            <w:tcW w:type="dxa" w:w="5040"/>
+            <w:shd w:val="clear" w:color="auto" w:fill="1F497D"/>
+          </w:tcPr>
+          <w:p>
+            <w:pPr>
+              <w:jc w:val="center"/>
+            </w:pPr>
+            <w:r/>
+            <w:r>
+              <w:rPr>
+                <w:b/>
+                <w:color w:val="FFFFFF"/>
+                <w:sz w:val="18"/>
+              </w:rPr>
+              <w:t>Result</w:t>
+            </w:r>
+          </w:p>
+        </w:tc>
+      </w:tr>
+      <w:tr>
+        <w:tc>
+          <w:tcPr>
+            <w:tcW w:type="dxa" w:w="5040"/>
+            <w:shd w:val="clear" w:color="auto" w:fill="F2F2F2"/>
+          </w:tcPr>
+          <w:p>
+            <w:r/>
+            <w:r>
+              <w:rPr>
+                <w:b w:val="0"/>
+                <w:sz w:val="16"/>
+              </w:rPr>
+              <w:t>TC_UI_01 Composition MOL_PCT — EC Matches DB Oracle</w:t>
+            </w:r>
+          </w:p>
+        </w:tc>
+        <w:tc>
+          <w:tcPr>
+            <w:tcW w:type="dxa" w:w="5040"/>
+            <w:shd w:val="clear" w:color="auto" w:fill="E2EFDA"/>
+          </w:tcPr>
+          <w:p>
+            <w:pPr>
+              <w:jc w:val="center"/>
+            </w:pPr>
+            <w:r/>
+            <w:r>
+              <w:rPr>
+                <w:b/>
+                <w:sz w:val="18"/>
+              </w:rPr>
+              <w:t>PASS</w:t>
+            </w:r>
+          </w:p>
+        </w:tc>
+      </w:tr>
+      <w:tr>
+        <w:tc>
+          <w:tcPr>
+            <w:tcW w:type="dxa" w:w="5040"/>
+            <w:shd w:val="clear" w:color="auto" w:fill="FFFFFF"/>
+          </w:tcPr>
+          <w:p>
+            <w:r/>
+            <w:r>
+              <w:rPr>
+                <w:b w:val="0"/>
+                <w:sz w:val="16"/>
+              </w:rPr>
+              <w:t>TC_UI_02 Composition WT_PCT — EC Matches DB Oracle</w:t>
+            </w:r>
+          </w:p>
+        </w:tc>
+        <w:tc>
+          <w:tcPr>
+            <w:tcW w:type="dxa" w:w="5040"/>
+            <w:shd w:val="clear" w:color="auto" w:fill="E2EFDA"/>
+          </w:tcPr>
+          <w:p>
+            <w:pPr>
+              <w:jc w:val="center"/>
+            </w:pPr>
+            <w:r/>
+            <w:r>
+              <w:rPr>
+                <w:b/>
+                <w:sz w:val="18"/>
+              </w:rPr>
+              <w:t>PASS</w:t>
+            </w:r>
+          </w:p>
+        </w:tc>
+      </w:tr>
+      <w:tr>
+        <w:tc>
+          <w:tcPr>
+            <w:tcW w:type="dxa" w:w="5040"/>
+            <w:shd w:val="clear" w:color="auto" w:fill="F2F2F2"/>
+          </w:tcPr>
+          <w:p>
+            <w:r/>
+            <w:r>
+              <w:rPr>
+                <w:b w:val="0"/>
+                <w:sz w:val="16"/>
+              </w:rPr>
+              <w:t>TC_UI_03 Analysis DENSITY — EC Matches DB Oracle</w:t>
+            </w:r>
+          </w:p>
+        </w:tc>
+        <w:tc>
+          <w:tcPr>
+            <w:tcW w:type="dxa" w:w="5040"/>
+            <w:shd w:val="clear" w:color="auto" w:fill="E2EFDA"/>
+          </w:tcPr>
+          <w:p>
+            <w:pPr>
+              <w:jc w:val="center"/>
+            </w:pPr>
+            <w:r/>
+            <w:r>
+              <w:rPr>
+                <w:b/>
+                <w:sz w:val="18"/>
+              </w:rPr>
+              <w:t>PASS</w:t>
+            </w:r>
+          </w:p>
+        </w:tc>
+      </w:tr>
+      <w:tr>
+        <w:tc>
+          <w:tcPr>
+            <w:tcW w:type="dxa" w:w="5040"/>
+            <w:shd w:val="clear" w:color="auto" w:fill="FFFFFF"/>
+          </w:tcPr>
+          <w:p>
+            <w:r/>
+            <w:r>
+              <w:rPr>
+                <w:b w:val="0"/>
+                <w:sz w:val="16"/>
+              </w:rPr>
+              <w:t>TC_UI_04 Analysis GCV — EC Matches DB Oracle</w:t>
+            </w:r>
+          </w:p>
+        </w:tc>
+        <w:tc>
+          <w:tcPr>
+            <w:tcW w:type="dxa" w:w="5040"/>
+            <w:shd w:val="clear" w:color="auto" w:fill="E2EFDA"/>
+          </w:tcPr>
+          <w:p>
+            <w:pPr>
+              <w:jc w:val="center"/>
+            </w:pPr>
+            <w:r/>
+            <w:r>
+              <w:rPr>
+                <w:b/>
+                <w:sz w:val="18"/>
+              </w:rPr>
+              <w:t>PASS</w:t>
+            </w:r>
+          </w:p>
+        </w:tc>
+      </w:tr>
+      <w:tr>
+        <w:tc>
+          <w:tcPr>
+            <w:tcW w:type="dxa" w:w="5040"/>
+            <w:shd w:val="clear" w:color="auto" w:fill="F2F2F2"/>
+          </w:tcPr>
+          <w:p>
+            <w:r/>
+            <w:r>
+              <w:rPr>
+                <w:b w:val="0"/>
+                <w:sz w:val="16"/>
+              </w:rPr>
+              <w:t>TC_UI_05 Tank GRS_VOL — EC Matches DB Oracle</w:t>
+            </w:r>
+          </w:p>
+        </w:tc>
+        <w:tc>
+          <w:tcPr>
+            <w:tcW w:type="dxa" w:w="5040"/>
+            <w:shd w:val="clear" w:color="auto" w:fill="E2EFDA"/>
+          </w:tcPr>
+          <w:p>
+            <w:pPr>
+              <w:jc w:val="center"/>
+            </w:pPr>
+            <w:r/>
+            <w:r>
+              <w:rPr>
+                <w:b/>
+                <w:sz w:val="18"/>
+              </w:rPr>
+              <w:t>PASS</w:t>
+            </w:r>
+          </w:p>
+        </w:tc>
+      </w:tr>
+      <w:tr>
+        <w:tc>
+          <w:tcPr>
+            <w:tcW w:type="dxa" w:w="5040"/>
+            <w:shd w:val="clear" w:color="auto" w:fill="FFFFFF"/>
+          </w:tcPr>
+          <w:p>
+            <w:r/>
+            <w:r>
+              <w:rPr>
+                <w:b w:val="0"/>
+                <w:sz w:val="16"/>
+              </w:rPr>
+              <w:t>TC_UI_06 Tank GRS_MASS — EC Matches DB Oracle</w:t>
+            </w:r>
+          </w:p>
+        </w:tc>
+        <w:tc>
+          <w:tcPr>
+            <w:tcW w:type="dxa" w:w="5040"/>
+            <w:shd w:val="clear" w:color="auto" w:fill="E2EFDA"/>
+          </w:tcPr>
+          <w:p>
+            <w:pPr>
+              <w:jc w:val="center"/>
+            </w:pPr>
+            <w:r/>
+            <w:r>
+              <w:rPr>
+                <w:b/>
+                <w:sz w:val="18"/>
+              </w:rPr>
+              <w:t>PASS</w:t>
+            </w:r>
+          </w:p>
+        </w:tc>
+      </w:tr>
+      <w:tr>
+        <w:tc>
+          <w:tcPr>
+            <w:tcW w:type="dxa" w:w="5040"/>
+            <w:shd w:val="clear" w:color="auto" w:fill="F2F2F2"/>
+          </w:tcPr>
+          <w:p>
+            <w:r/>
+            <w:r>
+              <w:rPr>
+                <w:b w:val="0"/>
+                <w:sz w:val="16"/>
+              </w:rPr>
+              <w:t>TC_UI_07 Tank AVG_TEMP — EC Matches DB Oracle</w:t>
+            </w:r>
+          </w:p>
+        </w:tc>
+        <w:tc>
+          <w:tcPr>
+            <w:tcW w:type="dxa" w:w="5040"/>
+            <w:shd w:val="clear" w:color="auto" w:fill="E2EFDA"/>
+          </w:tcPr>
+          <w:p>
+            <w:pPr>
+              <w:jc w:val="center"/>
+            </w:pPr>
+            <w:r/>
+            <w:r>
+              <w:rPr>
+                <w:b/>
+                <w:sz w:val="18"/>
+              </w:rPr>
+              <w:t>PASS</w:t>
+            </w:r>
+          </w:p>
+        </w:tc>
+      </w:tr>
+      <w:tr>
+        <w:tc>
+          <w:tcPr>
+            <w:tcW w:type="dxa" w:w="5040"/>
+            <w:shd w:val="clear" w:color="auto" w:fill="FFFFFF"/>
+          </w:tcPr>
+          <w:p>
+            <w:r/>
+            <w:r>
+              <w:rPr>
+                <w:b w:val="0"/>
+                <w:sz w:val="16"/>
+              </w:rPr>
+              <w:t>TC_UI_08 Tank STD_DENSITY — EC Matches DB Oracle</w:t>
+            </w:r>
+          </w:p>
+        </w:tc>
+        <w:tc>
+          <w:tcPr>
+            <w:tcW w:type="dxa" w:w="5040"/>
+            <w:shd w:val="clear" w:color="auto" w:fill="E2EFDA"/>
+          </w:tcPr>
+          <w:p>
+            <w:pPr>
+              <w:jc w:val="center"/>
+            </w:pPr>
+            <w:r/>
+            <w:r>
+              <w:rPr>
+                <w:b/>
+                <w:sz w:val="18"/>
+              </w:rPr>
+              <w:t>PASS</w:t>
+            </w:r>
+          </w:p>
+        </w:tc>
+      </w:tr>
+      <w:tr>
+        <w:tc>
+          <w:tcPr>
+            <w:tcW w:type="dxa" w:w="5040"/>
+            <w:shd w:val="clear" w:color="auto" w:fill="F2F2F2"/>
+          </w:tcPr>
+          <w:p>
+            <w:r/>
+            <w:r>
+              <w:rPr>
+                <w:b w:val="0"/>
+                <w:sz w:val="16"/>
+              </w:rPr>
+              <w:t>TC_UI_09 Composition UI Summary Matches DB Total</w:t>
+            </w:r>
+          </w:p>
+        </w:tc>
+        <w:tc>
+          <w:tcPr>
+            <w:tcW w:type="dxa" w:w="5040"/>
+            <w:shd w:val="clear" w:color="auto" w:fill="E2EFDA"/>
+          </w:tcPr>
+          <w:p>
+            <w:pPr>
+              <w:jc w:val="center"/>
+            </w:pPr>
+            <w:r/>
+            <w:r>
+              <w:rPr>
+                <w:b/>
+                <w:sz w:val="18"/>
+              </w:rPr>
+              <w:t>PASS</w:t>
+            </w:r>
+          </w:p>
+        </w:tc>
+      </w:tr>
+      <w:tr>
+        <w:tc>
+          <w:tcPr>
+            <w:tcW w:type="dxa" w:w="5040"/>
+            <w:shd w:val="clear" w:color="auto" w:fill="FFFFFF"/>
+          </w:tcPr>
+          <w:p>
+            <w:r/>
+            <w:r>
+              <w:rPr>
+                <w:b w:val="0"/>
+                <w:sz w:val="16"/>
+              </w:rPr>
+              <w:t>TC_UI_10 Analysis UI Summary Matches DB Total</w:t>
+            </w:r>
+          </w:p>
+        </w:tc>
+        <w:tc>
+          <w:tcPr>
+            <w:tcW w:type="dxa" w:w="5040"/>
+            <w:shd w:val="clear" w:color="auto" w:fill="E2EFDA"/>
+          </w:tcPr>
+          <w:p>
+            <w:pPr>
+              <w:jc w:val="center"/>
+            </w:pPr>
+            <w:r/>
+            <w:r>
+              <w:rPr>
+                <w:b/>
+                <w:sz w:val="18"/>
+              </w:rPr>
+              <w:t>PASS</w:t>
+            </w:r>
+          </w:p>
+        </w:tc>
+      </w:tr>
+      <w:tr>
+        <w:tc>
+          <w:tcPr>
+            <w:tcW w:type="dxa" w:w="5040"/>
+            <w:shd w:val="clear" w:color="auto" w:fill="F2F2F2"/>
+          </w:tcPr>
+          <w:p>
+            <w:r/>
+            <w:r>
+              <w:rPr>
+                <w:b w:val="0"/>
+                <w:sz w:val="16"/>
+              </w:rPr>
+              <w:t>TC_UI_11 Tank UI Summary Matches DB Total</w:t>
+            </w:r>
+          </w:p>
+        </w:tc>
+        <w:tc>
+          <w:tcPr>
+            <w:tcW w:type="dxa" w:w="5040"/>
+            <w:shd w:val="clear" w:color="auto" w:fill="E2EFDA"/>
+          </w:tcPr>
+          <w:p>
+            <w:pPr>
+              <w:jc w:val="center"/>
+            </w:pPr>
+            <w:r/>
+            <w:r>
+              <w:rPr>
+                <w:b/>
+                <w:sz w:val="18"/>
+              </w:rPr>
+              <w:t>PASS</w:t>
+            </w:r>
+          </w:p>
+        </w:tc>
+      </w:tr>
+    </w:tbl>
+    <w:p/>
+    <w:p>
+      <w:pPr>
+        <w:pStyle w:val="Heading2"/>
+      </w:pPr>
+      <w:r>
+        <w:t>9.3 Screen Evidence</w:t>
+      </w:r>
+    </w:p>
+    <w:p>
+      <w:r>
+        <w:rPr>
+          <w:i/>
+          <w:color w:val="444444"/>
+          <w:sz w:val="18"/>
+        </w:rPr>
+        <w:t>Validation Overview - Pluto Scarborough (2026-05-26): the 3 PHD check groups show Composition 8, Analysis 13, Tank 6 Errors (parent Daily PHD Validations = 27).</w:t>
+      </w:r>
+    </w:p>
+    <w:p>
+      <w:pPr>
+        <w:jc w:val="center"/>
+      </w:pPr>
+      <w:r>
+        <w:drawing>
+          <wp:inline xmlns:a="http://schemas.openxmlformats.org/drawingml/2006/main" xmlns:pic="http://schemas.openxmlformats.org/drawingml/2006/picture">
+            <wp:extent cx="6035040" cy="3372522"/>
+            <wp:docPr id="3" name="Picture 3"/>
+            <wp:cNvGraphicFramePr>
+              <a:graphicFrameLocks noChangeAspect="1"/>
+            </wp:cNvGraphicFramePr>
+            <a:graphic>
+              <a:graphicData uri="http://schemas.openxmlformats.org/drawingml/2006/picture">
+                <pic:pic>
+                  <pic:nvPicPr>
+                    <pic:cNvPr id="0" name="phase2_validation_overview.png"/>
+                    <pic:cNvPicPr/>
+                  </pic:nvPicPr>
+                  <pic:blipFill>
+                    <a:blip r:embed="rId22"/>
+                    <a:stretch>
+                      <a:fillRect/>
+                    </a:stretch>
+                  </pic:blipFill>
+                  <pic:spPr>
+                    <a:xfrm>
+                      <a:off x="0" y="0"/>
+                      <a:ext cx="6035040" cy="3372522"/>
+                    </a:xfrm>
+                    <a:prstGeom prst="rect"/>
+                  </pic:spPr>
+                </pic:pic>
+              </a:graphicData>
+            </a:graphic>
+          </wp:inline>
+        </w:drawing>
+      </w:r>
+    </w:p>
+    <w:p>
+      <w:r>
+        <w:rPr>
+          <w:i/>
+          <w:color w:val="444444"/>
+          <w:sz w:val="18"/>
+        </w:rPr>
+        <w:t>Robot Framework run report — validation_overview_pluto_scarborough.robot: 11/11 tests passed (headless on COPS DEV).</w:t>
+      </w:r>
+    </w:p>
+    <w:p>
+      <w:pPr>
+        <w:jc w:val="center"/>
+      </w:pPr>
+      <w:r>
+        <w:drawing>
+          <wp:inline xmlns:a="http://schemas.openxmlformats.org/drawingml/2006/main" xmlns:pic="http://schemas.openxmlformats.org/drawingml/2006/picture">
+            <wp:extent cx="6035040" cy="3372522"/>
+            <wp:docPr id="4" name="Picture 4"/>
+            <wp:cNvGraphicFramePr>
+              <a:graphicFrameLocks noChangeAspect="1"/>
+            </wp:cNvGraphicFramePr>
+            <a:graphic>
+              <a:graphicData uri="http://schemas.openxmlformats.org/drawingml/2006/picture">
+                <pic:pic>
+                  <pic:nvPicPr>
+                    <pic:cNvPr id="0" name="phase2_rf_report.png"/>
+                    <pic:cNvPicPr/>
+                  </pic:nvPicPr>
+                  <pic:blipFill>
+                    <a:blip r:embed="rId23"/>
+                    <a:stretch>
+                      <a:fillRect/>
+                    </a:stretch>
+                  </pic:blipFill>
+                  <pic:spPr>
+                    <a:xfrm>
+                      <a:off x="0" y="0"/>
+                      <a:ext cx="6035040" cy="3372522"/>
+                    </a:xfrm>
+                    <a:prstGeom prst="rect"/>
+                  </pic:spPr>
+                </pic:pic>
+              </a:graphicData>
+            </a:graphic>
+          </wp:inline>
+        </w:drawing>
+      </w:r>
+    </w:p>
+    <w:tbl>
+      <w:tblPr>
+        <w:tblStyle w:val="TableGrid"/>
+        <w:tblW w:type="auto" w:w="0"/>
+        <w:tblLook w:firstColumn="1" w:firstRow="1" w:lastColumn="0" w:lastRow="0" w:noHBand="0" w:noVBand="1" w:val="04A0"/>
+      </w:tblPr>
+      <w:tblGrid>
+        <w:gridCol w:w="10080"/>
+      </w:tblGrid>
+      <w:tr>
+        <w:tc>
+          <w:tcPr>
+            <w:tcW w:type="dxa" w:w="10080"/>
+            <w:shd w:val="clear" w:color="auto" w:fill="00B050"/>
+          </w:tcPr>
+          <w:p>
+            <w:pPr>
+              <w:jc w:val="center"/>
+            </w:pPr>
+            <w:r/>
+            <w:r>
+              <w:rPr>
+                <w:b/>
+                <w:color w:val="FFFFFF"/>
+                <w:sz w:val="26"/>
+              </w:rPr>
+              <w:t>PHASE 1 + CHECK GROUPS + PHASE 2 RF:   ALL PASS</w:t>
+            </w:r>
+          </w:p>
+        </w:tc>
+      </w:tr>
+    </w:tbl>
     <w:sectPr>
       <w:headerReference w:type="default" r:id="rId16"/>
       <w:footerReference w:type="default" r:id="rId17"/>

</xml_diff>

<commit_message>
Issue_1052: MOL% sum check rules (1156/1157) + EC web screen evidence
- New COMP_MOL_PCT sum-tolerance rules cloned from 1077/1083 (stream/well) + group links + rollbacks
- Fake-data patch/rollback for well MOL% (real wells carry no mole% data)
- Evidence doc: Section 11 sum check (defect fix, WT% re-verify, MOL% deploy + Layer-1) and EC web screen captures embedded in 5.5/10.4/10.5/11.5-11.7 (15 images)
- RF: Validation Overview tree pagination + Message-column filter keywords; sum/well/check-rule capture robots
- sum_check_unit_test_results.txt (Layer-1 record)

Co-Authored-By: Claude Opus 4.8 (1M context) <noreply@anthropic.com>
</commit_message>
<xml_diff>
--- a/workstreams/production-stability/sql-scripts/Issue1052_Evidence_COPS_DEV.docx
+++ b/workstreams/production-stability/sql-scripts/Issue1052_Evidence_COPS_DEV.docx
@@ -22238,6 +22238,193 @@
         </w:tc>
       </w:tr>
     </w:tbl>
+    <w:p/>
+    <w:p>
+      <w:pPr>
+        <w:pStyle w:val="Heading2"/>
+      </w:pPr>
+      <w:r>
+        <w:t>5.5  EC Web Screen Evidence — Phase-1 null/range ERRORs (Validation Overview)</w:t>
+      </w:r>
+    </w:p>
+    <w:p>
+      <w:r>
+        <w:rPr>
+          <w:sz w:val="18"/>
+        </w:rPr>
+        <w:t>Headless RF capture on COPS DEV. Each PHD validation group is selected on the Validation Overview screen and the result grid filtered on the Message column to isolate the null/range ERRORs of the Phase-1 rules (1142-1149).</w:t>
+      </w:r>
+    </w:p>
+    <w:p>
+      <w:pPr>
+        <w:pStyle w:val="Heading3"/>
+      </w:pPr>
+      <w:r>
+        <w:t>5.5.1  Stream Gas Component Analysis (Composition) — Mol%/Wt% null-range (1142/1143)</w:t>
+      </w:r>
+    </w:p>
+    <w:p>
+      <w:r>
+        <w:rPr>
+          <w:color w:val="606060"/>
+          <w:sz w:val="17"/>
+        </w:rPr>
+        <w:t>Validation Overview &gt; Stream Gas Component Analysis (Composition) - PHD Validations, 2026-05-26, Message filtered to "invalid or missing": the MOL_PCT (TC01) and WT_PCT (TC02) null/range ERRORs firing on screen.</w:t>
+      </w:r>
+    </w:p>
+    <w:p>
+      <w:pPr>
+        <w:jc w:val="center"/>
+      </w:pPr>
+      <w:r>
+        <w:drawing>
+          <wp:inline xmlns:a="http://schemas.openxmlformats.org/drawingml/2006/main" xmlns:pic="http://schemas.openxmlformats.org/drawingml/2006/picture">
+            <wp:extent cx="6217920" cy="3497580"/>
+            <wp:docPr id="10" name="Picture 10"/>
+            <wp:cNvGraphicFramePr>
+              <a:graphicFrameLocks noChangeAspect="1"/>
+            </wp:cNvGraphicFramePr>
+            <a:graphic>
+              <a:graphicData uri="http://schemas.openxmlformats.org/drawingml/2006/picture">
+                <pic:pic>
+                  <pic:nvPicPr>
+                    <pic:cNvPr id="0" name="phase1_composition_2026-05-26.png"/>
+                    <pic:cNvPicPr/>
+                  </pic:nvPicPr>
+                  <pic:blipFill>
+                    <a:blip r:embed="rId29"/>
+                    <a:stretch>
+                      <a:fillRect/>
+                    </a:stretch>
+                  </pic:blipFill>
+                  <pic:spPr>
+                    <a:xfrm>
+                      <a:off x="0" y="0"/>
+                      <a:ext cx="6217920" cy="3497580"/>
+                    </a:xfrm>
+                    <a:prstGeom prst="rect"/>
+                  </pic:spPr>
+                </pic:pic>
+              </a:graphicData>
+            </a:graphic>
+          </wp:inline>
+        </w:drawing>
+      </w:r>
+    </w:p>
+    <w:p/>
+    <w:p>
+      <w:pPr>
+        <w:pStyle w:val="Heading3"/>
+      </w:pPr>
+      <w:r>
+        <w:t>5.5.2  Stream Gas Component Analysis (Analysis) — Density/GCV null-range (1144/1145)</w:t>
+      </w:r>
+    </w:p>
+    <w:p>
+      <w:r>
+        <w:rPr>
+          <w:color w:val="606060"/>
+          <w:sz w:val="17"/>
+        </w:rPr>
+        <w:t>Stream Gas Component Analysis (Analysis) - PHD Validations, 2026-05-26: DENSITY (TC03) and GCV (TC04) null/range ERRORs.</w:t>
+      </w:r>
+    </w:p>
+    <w:p>
+      <w:pPr>
+        <w:jc w:val="center"/>
+      </w:pPr>
+      <w:r>
+        <w:drawing>
+          <wp:inline xmlns:a="http://schemas.openxmlformats.org/drawingml/2006/main" xmlns:pic="http://schemas.openxmlformats.org/drawingml/2006/picture">
+            <wp:extent cx="6217920" cy="3497580"/>
+            <wp:docPr id="11" name="Picture 11"/>
+            <wp:cNvGraphicFramePr>
+              <a:graphicFrameLocks noChangeAspect="1"/>
+            </wp:cNvGraphicFramePr>
+            <a:graphic>
+              <a:graphicData uri="http://schemas.openxmlformats.org/drawingml/2006/picture">
+                <pic:pic>
+                  <pic:nvPicPr>
+                    <pic:cNvPr id="0" name="phase1_analysis_2026-05-26.png"/>
+                    <pic:cNvPicPr/>
+                  </pic:nvPicPr>
+                  <pic:blipFill>
+                    <a:blip r:embed="rId30"/>
+                    <a:stretch>
+                      <a:fillRect/>
+                    </a:stretch>
+                  </pic:blipFill>
+                  <pic:spPr>
+                    <a:xfrm>
+                      <a:off x="0" y="0"/>
+                      <a:ext cx="6217920" cy="3497580"/>
+                    </a:xfrm>
+                    <a:prstGeom prst="rect"/>
+                  </pic:spPr>
+                </pic:pic>
+              </a:graphicData>
+            </a:graphic>
+          </wp:inline>
+        </w:drawing>
+      </w:r>
+    </w:p>
+    <w:p/>
+    <w:p>
+      <w:pPr>
+        <w:pStyle w:val="Heading3"/>
+      </w:pPr>
+      <w:r>
+        <w:t>5.5.3  Daily Tank Status — tank null-range (1146–1149)</w:t>
+      </w:r>
+    </w:p>
+    <w:p>
+      <w:r>
+        <w:rPr>
+          <w:color w:val="606060"/>
+          <w:sz w:val="17"/>
+        </w:rPr>
+        <w:t>Daily Tank Status - VCF Calc - PHD Validations, 2026-06-07: Gross Volume/Mass, Avg Temp and Std Density null/range ERRORs (TC05–TC08).</w:t>
+      </w:r>
+    </w:p>
+    <w:p>
+      <w:pPr>
+        <w:jc w:val="center"/>
+      </w:pPr>
+      <w:r>
+        <w:drawing>
+          <wp:inline xmlns:a="http://schemas.openxmlformats.org/drawingml/2006/main" xmlns:pic="http://schemas.openxmlformats.org/drawingml/2006/picture">
+            <wp:extent cx="6217920" cy="3497580"/>
+            <wp:docPr id="12" name="Picture 12"/>
+            <wp:cNvGraphicFramePr>
+              <a:graphicFrameLocks noChangeAspect="1"/>
+            </wp:cNvGraphicFramePr>
+            <a:graphic>
+              <a:graphicData uri="http://schemas.openxmlformats.org/drawingml/2006/picture">
+                <pic:pic>
+                  <pic:nvPicPr>
+                    <pic:cNvPr id="0" name="phase1_tank_2026-06-07.png"/>
+                    <pic:cNvPicPr/>
+                  </pic:nvPicPr>
+                  <pic:blipFill>
+                    <a:blip r:embed="rId31"/>
+                    <a:stretch>
+                      <a:fillRect/>
+                    </a:stretch>
+                  </pic:blipFill>
+                  <pic:spPr>
+                    <a:xfrm>
+                      <a:off x="0" y="0"/>
+                      <a:ext cx="6217920" cy="3497580"/>
+                    </a:xfrm>
+                    <a:prstGeom prst="rect"/>
+                  </pic:spPr>
+                </pic:pic>
+              </a:graphicData>
+            </a:graphic>
+          </wp:inline>
+        </w:drawing>
+      </w:r>
+    </w:p>
     <w:p/>
     <w:p>
       <w:pPr>
@@ -27005,6 +27192,2021 @@
         </w:tc>
       </w:tr>
     </w:tbl>
+    <w:p>
+      <w:r>
+        <w:br w:type="page"/>
+      </w:r>
+    </w:p>
+    <w:p>
+      <w:pPr>
+        <w:pStyle w:val="Heading2"/>
+      </w:pPr>
+      <w:r>
+        <w:t>10.4  Frozen — EC Web Screen Evidence (Validation Overview)</w:t>
+      </w:r>
+    </w:p>
+    <w:p>
+      <w:r>
+        <w:rPr>
+          <w:sz w:val="18"/>
+        </w:rPr>
+        <w:t>Headless RF capture on COPS DEV. The frozen check groups are run on the Validation Overview screen; the result grid is filtered on the Message column to isolate the frozen WARNINGs.</w:t>
+      </w:r>
+    </w:p>
+    <w:p>
+      <w:pPr>
+        <w:pStyle w:val="Heading3"/>
+      </w:pPr>
+      <w:r>
+        <w:t>10.4.1  Stream Gas Component Analysis (Analysis) — DENSITY &amp; GCV frozen (1152/1153)</w:t>
+      </w:r>
+    </w:p>
+    <w:p>
+      <w:r>
+        <w:rPr>
+          <w:color w:val="606060"/>
+          <w:sz w:val="17"/>
+        </w:rPr>
+        <w:t>Validation Overview - Pluto Scarborough &gt; Stream Gas Component Analysis (Analysis) - PHD Validations, 2025-12-13. Message filtered to "same as previous day": 12 frozen WARNINGs (DENSITY + GCV across 6 streams) surfacing on screen.</w:t>
+      </w:r>
+    </w:p>
+    <w:p>
+      <w:pPr>
+        <w:jc w:val="center"/>
+      </w:pPr>
+      <w:r>
+        <w:drawing>
+          <wp:inline xmlns:a="http://schemas.openxmlformats.org/drawingml/2006/main" xmlns:pic="http://schemas.openxmlformats.org/drawingml/2006/picture">
+            <wp:extent cx="6217920" cy="3497580"/>
+            <wp:docPr id="8" name="Picture 8"/>
+            <wp:cNvGraphicFramePr>
+              <a:graphicFrameLocks noChangeAspect="1"/>
+            </wp:cNvGraphicFramePr>
+            <a:graphic>
+              <a:graphicData uri="http://schemas.openxmlformats.org/drawingml/2006/picture">
+                <pic:pic>
+                  <pic:nvPicPr>
+                    <pic:cNvPr id="0" name="frozen_analysis_2025-12-13.png"/>
+                    <pic:cNvPicPr/>
+                  </pic:nvPicPr>
+                  <pic:blipFill>
+                    <a:blip r:embed="rId27"/>
+                    <a:stretch>
+                      <a:fillRect/>
+                    </a:stretch>
+                  </pic:blipFill>
+                  <pic:spPr>
+                    <a:xfrm>
+                      <a:off x="0" y="0"/>
+                      <a:ext cx="6217920" cy="3497580"/>
+                    </a:xfrm>
+                    <a:prstGeom prst="rect"/>
+                  </pic:spPr>
+                </pic:pic>
+              </a:graphicData>
+            </a:graphic>
+          </wp:inline>
+        </w:drawing>
+      </w:r>
+    </w:p>
+    <w:p/>
+    <w:p>
+      <w:pPr>
+        <w:pStyle w:val="Heading3"/>
+      </w:pPr>
+      <w:r>
+        <w:t>10.4.2  Daily Stream Water Status — Oil-in-Water frozen (1154)</w:t>
+      </w:r>
+    </w:p>
+    <w:p>
+      <w:r>
+        <w:rPr>
+          <w:color w:val="606060"/>
+          <w:sz w:val="17"/>
+        </w:rPr>
+        <w:t>Daily Stream Water Status - PHD Validations, 2026-05-24, filtered to "same as previous day": the Oil-in-Water frozen WARNING (rule 1154) on screen.</w:t>
+      </w:r>
+    </w:p>
+    <w:p>
+      <w:pPr>
+        <w:jc w:val="center"/>
+      </w:pPr>
+      <w:r>
+        <w:drawing>
+          <wp:inline xmlns:a="http://schemas.openxmlformats.org/drawingml/2006/main" xmlns:pic="http://schemas.openxmlformats.org/drawingml/2006/picture">
+            <wp:extent cx="6217920" cy="3497580"/>
+            <wp:docPr id="9" name="Picture 9"/>
+            <wp:cNvGraphicFramePr>
+              <a:graphicFrameLocks noChangeAspect="1"/>
+            </wp:cNvGraphicFramePr>
+            <a:graphic>
+              <a:graphicData uri="http://schemas.openxmlformats.org/drawingml/2006/picture">
+                <pic:pic>
+                  <pic:nvPicPr>
+                    <pic:cNvPr id="0" name="frozen_water_2026-05-24.png"/>
+                    <pic:cNvPicPr/>
+                  </pic:nvPicPr>
+                  <pic:blipFill>
+                    <a:blip r:embed="rId28"/>
+                    <a:stretch>
+                      <a:fillRect/>
+                    </a:stretch>
+                  </pic:blipFill>
+                  <pic:spPr>
+                    <a:xfrm>
+                      <a:off x="0" y="0"/>
+                      <a:ext cx="6217920" cy="3497580"/>
+                    </a:xfrm>
+                    <a:prstGeom prst="rect"/>
+                  </pic:spPr>
+                </pic:pic>
+              </a:graphicData>
+            </a:graphic>
+          </wp:inline>
+        </w:drawing>
+      </w:r>
+    </w:p>
+    <w:p/>
+    <w:p>
+      <w:pPr>
+        <w:pStyle w:val="Heading2"/>
+      </w:pPr>
+      <w:r>
+        <w:t>10.5  Frozen rules deployed — Check Rule maintenance screen</w:t>
+      </w:r>
+    </w:p>
+    <w:p>
+      <w:r>
+        <w:rPr>
+          <w:sz w:val="18"/>
+        </w:rPr>
+        <w:t>Check Rule screen (Configuration &gt; System) filtered to "FROZEN_V1": all 6 frozen rules (1150-1155) configured — CHECK_ID, name, RV view, Where Formula (${FunctionFrozenValue} = ${ConstBOOLEAN}), Check Message and Severity (Warning). 1150/1151 are the ON-HOLD composition rules.</w:t>
+      </w:r>
+    </w:p>
+    <w:p>
+      <w:pPr>
+        <w:jc w:val="center"/>
+      </w:pPr>
+      <w:r>
+        <w:drawing>
+          <wp:inline xmlns:a="http://schemas.openxmlformats.org/drawingml/2006/main" xmlns:pic="http://schemas.openxmlformats.org/drawingml/2006/picture">
+            <wp:extent cx="6217920" cy="3497580"/>
+            <wp:docPr id="13" name="Picture 13"/>
+            <wp:cNvGraphicFramePr>
+              <a:graphicFrameLocks noChangeAspect="1"/>
+            </wp:cNvGraphicFramePr>
+            <a:graphic>
+              <a:graphicData uri="http://schemas.openxmlformats.org/drawingml/2006/picture">
+                <pic:pic>
+                  <pic:nvPicPr>
+                    <pic:cNvPr id="0" name="check_rule_FROZEN.png"/>
+                    <pic:cNvPicPr/>
+                  </pic:nvPicPr>
+                  <pic:blipFill>
+                    <a:blip r:embed="rId32"/>
+                    <a:stretch>
+                      <a:fillRect/>
+                    </a:stretch>
+                  </pic:blipFill>
+                  <pic:spPr>
+                    <a:xfrm>
+                      <a:off x="0" y="0"/>
+                      <a:ext cx="6217920" cy="3497580"/>
+                    </a:xfrm>
+                    <a:prstGeom prst="rect"/>
+                  </pic:spPr>
+                </pic:pic>
+              </a:graphicData>
+            </a:graphic>
+          </wp:inline>
+        </w:drawing>
+      </w:r>
+    </w:p>
+    <w:p/>
+    <w:p>
+      <w:pPr>
+        <w:pStyle w:val="Heading1"/>
+      </w:pPr>
+      <w:r>
+        <w:t>11. Sum 98–102% Composition Check (Layer-1)</w:t>
+      </w:r>
+    </w:p>
+    <w:p>
+      <w:r>
+        <w:rPr>
+          <w:sz w:val="20"/>
+        </w:rPr>
+        <w:t>The composition sum check (ZWP_P_VALIDATION.isComponentSumOutOfTolerance) asserts that the sum of a gas analysis’s component percentages is within the 98%–102% tolerance band. A defect was found and fixed, the existing weight-% rules were re-verified, and two new mole-% rules were added and tested.</w:t>
+      </w:r>
+    </w:p>
+    <w:p>
+      <w:pPr>
+        <w:pStyle w:val="Heading2"/>
+      </w:pPr>
+      <w:r>
+        <w:t>11.1 Defect fix — inverted tolerance band</w:t>
+      </w:r>
+    </w:p>
+    <w:p>
+      <w:r>
+        <w:rPr>
+          <w:sz w:val="18"/>
+        </w:rPr>
+        <w:t>The NVL fallback defaults were swapped, so with the tolerance system attributes unset the band was lower=1.02 / upper=0.98 (inverted) and EVERY composition fired — even a valid 100% sum. Fixed in ZWP_P_VALIDATION (package body recompiled 2026-06-10 20:57:10, STATUS VALID): upper=NVL(_UPPER,1.02), lower=NVL(_LOWER,0.98) — valid band now [0.98 .. 1.02], so a 100% sum PASSES and only true &lt;98% / &gt;102% sums fire.</w:t>
+      </w:r>
+    </w:p>
+    <w:p>
+      <w:pPr>
+        <w:pStyle w:val="Heading2"/>
+      </w:pPr>
+      <w:r>
+        <w:t>11.2 Weight % (COMP_WT_PCT) — rules 1077 / 1083 re-verified post-fix</w:t>
+      </w:r>
+    </w:p>
+    <w:tbl>
+      <w:tblPr>
+        <w:tblStyle w:val="TableGrid"/>
+        <w:tblW w:type="auto" w:w="0"/>
+        <w:tblLook w:firstColumn="1" w:firstRow="1" w:lastColumn="0" w:lastRow="0" w:noHBand="0" w:noVBand="1" w:val="04A0"/>
+      </w:tblPr>
+      <w:tblGrid>
+        <w:gridCol w:w="2016"/>
+        <w:gridCol w:w="2016"/>
+        <w:gridCol w:w="2016"/>
+        <w:gridCol w:w="2016"/>
+        <w:gridCol w:w="2016"/>
+      </w:tblGrid>
+      <w:tr>
+        <w:tc>
+          <w:tcPr>
+            <w:tcW w:type="dxa" w:w="2016"/>
+            <w:shd w:val="clear" w:color="auto" w:fill="1F497D"/>
+          </w:tcPr>
+          <w:p>
+            <w:pPr>
+              <w:jc w:val="center"/>
+            </w:pPr>
+            <w:r/>
+            <w:r>
+              <w:rPr>
+                <w:b/>
+                <w:color w:val="FFFFFF"/>
+                <w:sz w:val="16"/>
+              </w:rPr>
+              <w:t>Case</w:t>
+            </w:r>
+          </w:p>
+        </w:tc>
+        <w:tc>
+          <w:tcPr>
+            <w:tcW w:type="dxa" w:w="2016"/>
+            <w:shd w:val="clear" w:color="auto" w:fill="1F497D"/>
+          </w:tcPr>
+          <w:p>
+            <w:pPr>
+              <w:jc w:val="center"/>
+            </w:pPr>
+            <w:r/>
+            <w:r>
+              <w:rPr>
+                <w:b/>
+                <w:color w:val="FFFFFF"/>
+                <w:sz w:val="16"/>
+              </w:rPr>
+              <w:t>Date</w:t>
+            </w:r>
+          </w:p>
+        </w:tc>
+        <w:tc>
+          <w:tcPr>
+            <w:tcW w:type="dxa" w:w="2016"/>
+            <w:shd w:val="clear" w:color="auto" w:fill="1F497D"/>
+          </w:tcPr>
+          <w:p>
+            <w:pPr>
+              <w:jc w:val="center"/>
+            </w:pPr>
+            <w:r/>
+            <w:r>
+              <w:rPr>
+                <w:b/>
+                <w:color w:val="FFFFFF"/>
+                <w:sz w:val="16"/>
+              </w:rPr>
+              <w:t>Data</w:t>
+            </w:r>
+          </w:p>
+        </w:tc>
+        <w:tc>
+          <w:tcPr>
+            <w:tcW w:type="dxa" w:w="2016"/>
+            <w:shd w:val="clear" w:color="auto" w:fill="1F497D"/>
+          </w:tcPr>
+          <w:p>
+            <w:pPr>
+              <w:jc w:val="center"/>
+            </w:pPr>
+            <w:r/>
+            <w:r>
+              <w:rPr>
+                <w:b/>
+                <w:color w:val="FFFFFF"/>
+                <w:sz w:val="16"/>
+              </w:rPr>
+              <w:t>ret</w:t>
+            </w:r>
+          </w:p>
+        </w:tc>
+        <w:tc>
+          <w:tcPr>
+            <w:tcW w:type="dxa" w:w="2016"/>
+            <w:shd w:val="clear" w:color="auto" w:fill="1F497D"/>
+          </w:tcPr>
+          <w:p>
+            <w:pPr>
+              <w:jc w:val="center"/>
+            </w:pPr>
+            <w:r/>
+            <w:r>
+              <w:rPr>
+                <w:b/>
+                <w:color w:val="FFFFFF"/>
+                <w:sz w:val="16"/>
+              </w:rPr>
+              <w:t>Verdict</w:t>
+            </w:r>
+          </w:p>
+        </w:tc>
+      </w:tr>
+      <w:tr>
+        <w:tc>
+          <w:tcPr>
+            <w:tcW w:type="dxa" w:w="2016"/>
+            <w:shd w:val="clear" w:color="auto" w:fill="FFFFFF"/>
+          </w:tcPr>
+          <w:p>
+            <w:r/>
+            <w:r>
+              <w:rPr>
+                <w:b w:val="0"/>
+                <w:sz w:val="17"/>
+              </w:rPr>
+              <w:t>1077 Stream — valid</w:t>
+            </w:r>
+          </w:p>
+        </w:tc>
+        <w:tc>
+          <w:tcPr>
+            <w:tcW w:type="dxa" w:w="2016"/>
+            <w:shd w:val="clear" w:color="auto" w:fill="FFFFFF"/>
+          </w:tcPr>
+          <w:p>
+            <w:pPr>
+              <w:jc w:val="center"/>
+            </w:pPr>
+            <w:r/>
+            <w:r>
+              <w:rPr>
+                <w:b w:val="0"/>
+                <w:sz w:val="17"/>
+              </w:rPr>
+              <w:t>2026-08-31</w:t>
+            </w:r>
+          </w:p>
+        </w:tc>
+        <w:tc>
+          <w:tcPr>
+            <w:tcW w:type="dxa" w:w="2016"/>
+            <w:shd w:val="clear" w:color="auto" w:fill="FFFFFF"/>
+          </w:tcPr>
+          <w:p>
+            <w:r/>
+            <w:r>
+              <w:rPr>
+                <w:b w:val="0"/>
+                <w:sz w:val="17"/>
+              </w:rPr>
+              <w:t>ANA 2605 1C1401 sum=100</w:t>
+            </w:r>
+          </w:p>
+        </w:tc>
+        <w:tc>
+          <w:tcPr>
+            <w:tcW w:type="dxa" w:w="2016"/>
+            <w:shd w:val="clear" w:color="auto" w:fill="FFFFFF"/>
+          </w:tcPr>
+          <w:p>
+            <w:pPr>
+              <w:jc w:val="center"/>
+            </w:pPr>
+            <w:r/>
+            <w:r>
+              <w:rPr>
+                <w:b w:val="0"/>
+                <w:sz w:val="17"/>
+              </w:rPr>
+              <w:t>NO</w:t>
+            </w:r>
+          </w:p>
+        </w:tc>
+        <w:tc>
+          <w:tcPr>
+            <w:tcW w:type="dxa" w:w="2016"/>
+            <w:shd w:val="clear" w:color="auto" w:fill="C6EFCE"/>
+          </w:tcPr>
+          <w:p>
+            <w:pPr>
+              <w:jc w:val="center"/>
+            </w:pPr>
+            <w:r/>
+            <w:r>
+              <w:rPr>
+                <w:b/>
+                <w:sz w:val="18"/>
+              </w:rPr>
+              <w:t>PASS</w:t>
+            </w:r>
+          </w:p>
+        </w:tc>
+      </w:tr>
+      <w:tr>
+        <w:tc>
+          <w:tcPr>
+            <w:tcW w:type="dxa" w:w="2016"/>
+            <w:shd w:val="clear" w:color="auto" w:fill="F2F2F2"/>
+          </w:tcPr>
+          <w:p>
+            <w:r/>
+            <w:r>
+              <w:rPr>
+                <w:b w:val="0"/>
+                <w:sz w:val="17"/>
+              </w:rPr>
+              <w:t>1083 Well — valid</w:t>
+            </w:r>
+          </w:p>
+        </w:tc>
+        <w:tc>
+          <w:tcPr>
+            <w:tcW w:type="dxa" w:w="2016"/>
+            <w:shd w:val="clear" w:color="auto" w:fill="F2F2F2"/>
+          </w:tcPr>
+          <w:p>
+            <w:pPr>
+              <w:jc w:val="center"/>
+            </w:pPr>
+            <w:r/>
+            <w:r>
+              <w:rPr>
+                <w:b w:val="0"/>
+                <w:sz w:val="17"/>
+              </w:rPr>
+              <w:t>2025-12-01</w:t>
+            </w:r>
+          </w:p>
+        </w:tc>
+        <w:tc>
+          <w:tcPr>
+            <w:tcW w:type="dxa" w:w="2016"/>
+            <w:shd w:val="clear" w:color="auto" w:fill="F2F2F2"/>
+          </w:tcPr>
+          <w:p>
+            <w:r/>
+            <w:r>
+              <w:rPr>
+                <w:b w:val="0"/>
+                <w:sz w:val="17"/>
+              </w:rPr>
+              <w:t>12 Pluto A wells sum=100</w:t>
+            </w:r>
+          </w:p>
+        </w:tc>
+        <w:tc>
+          <w:tcPr>
+            <w:tcW w:type="dxa" w:w="2016"/>
+            <w:shd w:val="clear" w:color="auto" w:fill="F2F2F2"/>
+          </w:tcPr>
+          <w:p>
+            <w:pPr>
+              <w:jc w:val="center"/>
+            </w:pPr>
+            <w:r/>
+            <w:r>
+              <w:rPr>
+                <w:b w:val="0"/>
+                <w:sz w:val="17"/>
+              </w:rPr>
+              <w:t>NO</w:t>
+            </w:r>
+          </w:p>
+        </w:tc>
+        <w:tc>
+          <w:tcPr>
+            <w:tcW w:type="dxa" w:w="2016"/>
+            <w:shd w:val="clear" w:color="auto" w:fill="C6EFCE"/>
+          </w:tcPr>
+          <w:p>
+            <w:pPr>
+              <w:jc w:val="center"/>
+            </w:pPr>
+            <w:r/>
+            <w:r>
+              <w:rPr>
+                <w:b/>
+                <w:sz w:val="18"/>
+              </w:rPr>
+              <w:t>PASS</w:t>
+            </w:r>
+          </w:p>
+        </w:tc>
+      </w:tr>
+      <w:tr>
+        <w:tc>
+          <w:tcPr>
+            <w:tcW w:type="dxa" w:w="2016"/>
+            <w:shd w:val="clear" w:color="auto" w:fill="FFFFFF"/>
+          </w:tcPr>
+          <w:p>
+            <w:r/>
+            <w:r>
+              <w:rPr>
+                <w:b w:val="0"/>
+                <w:sz w:val="17"/>
+              </w:rPr>
+              <w:t>1077 Stream — out-of-range</w:t>
+            </w:r>
+          </w:p>
+        </w:tc>
+        <w:tc>
+          <w:tcPr>
+            <w:tcW w:type="dxa" w:w="2016"/>
+            <w:shd w:val="clear" w:color="auto" w:fill="FFFFFF"/>
+          </w:tcPr>
+          <w:p>
+            <w:pPr>
+              <w:jc w:val="center"/>
+            </w:pPr>
+            <w:r/>
+            <w:r>
+              <w:rPr>
+                <w:b w:val="0"/>
+                <w:sz w:val="17"/>
+              </w:rPr>
+              <w:t>2025-12-11 / 2026-05-03</w:t>
+            </w:r>
+          </w:p>
+        </w:tc>
+        <w:tc>
+          <w:tcPr>
+            <w:tcW w:type="dxa" w:w="2016"/>
+            <w:shd w:val="clear" w:color="auto" w:fill="FFFFFF"/>
+          </w:tcPr>
+          <w:p>
+            <w:r/>
+            <w:r>
+              <w:rPr>
+                <w:b w:val="0"/>
+                <w:sz w:val="17"/>
+              </w:rPr>
+              <w:t>VENT_T1_HP_N2 0.02 / 1C1401_TO_E140 45.42</w:t>
+            </w:r>
+          </w:p>
+        </w:tc>
+        <w:tc>
+          <w:tcPr>
+            <w:tcW w:type="dxa" w:w="2016"/>
+            <w:shd w:val="clear" w:color="auto" w:fill="FFFFFF"/>
+          </w:tcPr>
+          <w:p>
+            <w:pPr>
+              <w:jc w:val="center"/>
+            </w:pPr>
+            <w:r/>
+            <w:r>
+              <w:rPr>
+                <w:b w:val="0"/>
+                <w:sz w:val="17"/>
+              </w:rPr>
+              <w:t>YES</w:t>
+            </w:r>
+          </w:p>
+        </w:tc>
+        <w:tc>
+          <w:tcPr>
+            <w:tcW w:type="dxa" w:w="2016"/>
+            <w:shd w:val="clear" w:color="auto" w:fill="C6EFCE"/>
+          </w:tcPr>
+          <w:p>
+            <w:pPr>
+              <w:jc w:val="center"/>
+            </w:pPr>
+            <w:r/>
+            <w:r>
+              <w:rPr>
+                <w:b/>
+                <w:sz w:val="18"/>
+              </w:rPr>
+              <w:t>FIRES</w:t>
+            </w:r>
+          </w:p>
+        </w:tc>
+      </w:tr>
+      <w:tr>
+        <w:tc>
+          <w:tcPr>
+            <w:tcW w:type="dxa" w:w="2016"/>
+            <w:shd w:val="clear" w:color="auto" w:fill="F2F2F2"/>
+          </w:tcPr>
+          <w:p>
+            <w:r/>
+            <w:r>
+              <w:rPr>
+                <w:b w:val="0"/>
+                <w:sz w:val="17"/>
+              </w:rPr>
+              <w:t>1083 Well — out-of-range</w:t>
+            </w:r>
+          </w:p>
+        </w:tc>
+        <w:tc>
+          <w:tcPr>
+            <w:tcW w:type="dxa" w:w="2016"/>
+            <w:shd w:val="clear" w:color="auto" w:fill="F2F2F2"/>
+          </w:tcPr>
+          <w:p>
+            <w:pPr>
+              <w:jc w:val="center"/>
+            </w:pPr>
+            <w:r/>
+            <w:r>
+              <w:rPr>
+                <w:b w:val="0"/>
+                <w:sz w:val="17"/>
+              </w:rPr>
+              <w:t>2026-08-31</w:t>
+            </w:r>
+          </w:p>
+        </w:tc>
+        <w:tc>
+          <w:tcPr>
+            <w:tcW w:type="dxa" w:w="2016"/>
+            <w:shd w:val="clear" w:color="auto" w:fill="F2F2F2"/>
+          </w:tcPr>
+          <w:p>
+            <w:r/>
+            <w:r>
+              <w:rPr>
+                <w:b w:val="0"/>
+                <w:sz w:val="17"/>
+              </w:rPr>
+              <w:t>PLA-08 sum=110</w:t>
+            </w:r>
+          </w:p>
+        </w:tc>
+        <w:tc>
+          <w:tcPr>
+            <w:tcW w:type="dxa" w:w="2016"/>
+            <w:shd w:val="clear" w:color="auto" w:fill="F2F2F2"/>
+          </w:tcPr>
+          <w:p>
+            <w:pPr>
+              <w:jc w:val="center"/>
+            </w:pPr>
+            <w:r/>
+            <w:r>
+              <w:rPr>
+                <w:b w:val="0"/>
+                <w:sz w:val="17"/>
+              </w:rPr>
+              <w:t>YES</w:t>
+            </w:r>
+          </w:p>
+        </w:tc>
+        <w:tc>
+          <w:tcPr>
+            <w:tcW w:type="dxa" w:w="2016"/>
+            <w:shd w:val="clear" w:color="auto" w:fill="C6EFCE"/>
+          </w:tcPr>
+          <w:p>
+            <w:pPr>
+              <w:jc w:val="center"/>
+            </w:pPr>
+            <w:r/>
+            <w:r>
+              <w:rPr>
+                <w:b/>
+                <w:sz w:val="18"/>
+              </w:rPr>
+              <w:t>FIRES</w:t>
+            </w:r>
+          </w:p>
+        </w:tc>
+      </w:tr>
+    </w:tbl>
+    <w:p>
+      <w:r>
+        <w:rPr>
+          <w:sz w:val="18"/>
+        </w:rPr>
+        <w:t>Result: 13/13 valid sums PASS, 3/3 out-of-range sums FIRE. Both bounds enforced.</w:t>
+      </w:r>
+    </w:p>
+    <w:p>
+      <w:pPr>
+        <w:pStyle w:val="Heading2"/>
+      </w:pPr>
+      <w:r>
+        <w:t>11.3 Mole % (COMP_MOL_PCT) — new rules deployed (live on COPS DEV)</w:t>
+      </w:r>
+    </w:p>
+    <w:p>
+      <w:r>
+        <w:rPr>
+          <w:sz w:val="18"/>
+        </w:rPr>
+        <w:t>Cloned from 1077/1083 (full-row diff); only change is the tested column P_COLUMN_NAME = COMP_MOL_PCT. Scripts: Issue1052_PHD_Sum_MolPct_Checks.sql (+ _ROLLBACK) and _Check_Group.sql (+ _ROLLBACK); deploy→verify→rollback→byte-clean→re-load all confirmed.</w:t>
+      </w:r>
+    </w:p>
+    <w:tbl>
+      <w:tblPr>
+        <w:tblStyle w:val="TableGrid"/>
+        <w:tblW w:type="auto" w:w="0"/>
+        <w:tblLook w:firstColumn="1" w:firstRow="1" w:lastColumn="0" w:lastRow="0" w:noHBand="0" w:noVBand="1" w:val="04A0"/>
+      </w:tblPr>
+      <w:tblGrid>
+        <w:gridCol w:w="1680"/>
+        <w:gridCol w:w="1680"/>
+        <w:gridCol w:w="1680"/>
+        <w:gridCol w:w="1680"/>
+        <w:gridCol w:w="1680"/>
+        <w:gridCol w:w="1680"/>
+      </w:tblGrid>
+      <w:tr>
+        <w:tc>
+          <w:tcPr>
+            <w:tcW w:type="dxa" w:w="1680"/>
+            <w:shd w:val="clear" w:color="auto" w:fill="1F497D"/>
+          </w:tcPr>
+          <w:p>
+            <w:pPr>
+              <w:jc w:val="center"/>
+            </w:pPr>
+            <w:r/>
+            <w:r>
+              <w:rPr>
+                <w:b/>
+                <w:color w:val="FFFFFF"/>
+                <w:sz w:val="16"/>
+              </w:rPr>
+              <w:t>CHECK_ID</w:t>
+            </w:r>
+          </w:p>
+        </w:tc>
+        <w:tc>
+          <w:tcPr>
+            <w:tcW w:type="dxa" w:w="1680"/>
+            <w:shd w:val="clear" w:color="auto" w:fill="1F497D"/>
+          </w:tcPr>
+          <w:p>
+            <w:pPr>
+              <w:jc w:val="center"/>
+            </w:pPr>
+            <w:r/>
+            <w:r>
+              <w:rPr>
+                <w:b/>
+                <w:color w:val="FFFFFF"/>
+                <w:sz w:val="16"/>
+              </w:rPr>
+              <w:t>Rule</w:t>
+            </w:r>
+          </w:p>
+        </w:tc>
+        <w:tc>
+          <w:tcPr>
+            <w:tcW w:type="dxa" w:w="1680"/>
+            <w:shd w:val="clear" w:color="auto" w:fill="1F497D"/>
+          </w:tcPr>
+          <w:p>
+            <w:pPr>
+              <w:jc w:val="center"/>
+            </w:pPr>
+            <w:r/>
+            <w:r>
+              <w:rPr>
+                <w:b/>
+                <w:color w:val="FFFFFF"/>
+                <w:sz w:val="16"/>
+              </w:rPr>
+              <w:t>Class / TABLE_ID</w:t>
+            </w:r>
+          </w:p>
+        </w:tc>
+        <w:tc>
+          <w:tcPr>
+            <w:tcW w:type="dxa" w:w="1680"/>
+            <w:shd w:val="clear" w:color="auto" w:fill="1F497D"/>
+          </w:tcPr>
+          <w:p>
+            <w:pPr>
+              <w:jc w:val="center"/>
+            </w:pPr>
+            <w:r/>
+            <w:r>
+              <w:rPr>
+                <w:b/>
+                <w:color w:val="FFFFFF"/>
+                <w:sz w:val="16"/>
+              </w:rPr>
+              <w:t>Sev</w:t>
+            </w:r>
+          </w:p>
+        </w:tc>
+        <w:tc>
+          <w:tcPr>
+            <w:tcW w:type="dxa" w:w="1680"/>
+            <w:shd w:val="clear" w:color="auto" w:fill="1F497D"/>
+          </w:tcPr>
+          <w:p>
+            <w:pPr>
+              <w:jc w:val="center"/>
+            </w:pPr>
+            <w:r/>
+            <w:r>
+              <w:rPr>
+                <w:b/>
+                <w:color w:val="FFFFFF"/>
+                <w:sz w:val="16"/>
+              </w:rPr>
+              <w:t>Group</w:t>
+            </w:r>
+          </w:p>
+        </w:tc>
+        <w:tc>
+          <w:tcPr>
+            <w:tcW w:type="dxa" w:w="1680"/>
+            <w:shd w:val="clear" w:color="auto" w:fill="1F497D"/>
+          </w:tcPr>
+          <w:p>
+            <w:pPr>
+              <w:jc w:val="center"/>
+            </w:pPr>
+            <w:r/>
+            <w:r>
+              <w:rPr>
+                <w:b/>
+                <w:color w:val="FFFFFF"/>
+                <w:sz w:val="16"/>
+              </w:rPr>
+              <w:t>P_COLUMN_NAME</w:t>
+            </w:r>
+          </w:p>
+        </w:tc>
+      </w:tr>
+      <w:tr>
+        <w:tc>
+          <w:tcPr>
+            <w:tcW w:type="dxa" w:w="1680"/>
+            <w:shd w:val="clear" w:color="auto" w:fill="FFFFFF"/>
+          </w:tcPr>
+          <w:p>
+            <w:pPr>
+              <w:jc w:val="center"/>
+            </w:pPr>
+            <w:r/>
+            <w:r>
+              <w:rPr>
+                <w:b w:val="0"/>
+                <w:sz w:val="16"/>
+              </w:rPr>
+              <w:t>1156</w:t>
+            </w:r>
+          </w:p>
+        </w:tc>
+        <w:tc>
+          <w:tcPr>
+            <w:tcW w:type="dxa" w:w="1680"/>
+            <w:shd w:val="clear" w:color="auto" w:fill="FFFFFF"/>
+          </w:tcPr>
+          <w:p>
+            <w:r/>
+            <w:r>
+              <w:rPr>
+                <w:b w:val="0"/>
+                <w:sz w:val="16"/>
+              </w:rPr>
+              <w:t>DAILY_SAMPLING_STRM_GAS_COMPONENT_COMP_MOL_PCT_V1</w:t>
+            </w:r>
+          </w:p>
+        </w:tc>
+        <w:tc>
+          <w:tcPr>
+            <w:tcW w:type="dxa" w:w="1680"/>
+            <w:shd w:val="clear" w:color="auto" w:fill="FFFFFF"/>
+          </w:tcPr>
+          <w:p>
+            <w:r/>
+            <w:r>
+              <w:rPr>
+                <w:b w:val="0"/>
+                <w:sz w:val="16"/>
+              </w:rPr>
+              <w:t>RV_STRM_GAS_ANALYSIS</w:t>
+            </w:r>
+          </w:p>
+        </w:tc>
+        <w:tc>
+          <w:tcPr>
+            <w:tcW w:type="dxa" w:w="1680"/>
+            <w:shd w:val="clear" w:color="auto" w:fill="FFFFFF"/>
+          </w:tcPr>
+          <w:p>
+            <w:pPr>
+              <w:jc w:val="center"/>
+            </w:pPr>
+            <w:r/>
+            <w:r>
+              <w:rPr>
+                <w:b w:val="0"/>
+                <w:sz w:val="16"/>
+              </w:rPr>
+              <w:t>ERROR</w:t>
+            </w:r>
+          </w:p>
+        </w:tc>
+        <w:tc>
+          <w:tcPr>
+            <w:tcW w:type="dxa" w:w="1680"/>
+            <w:shd w:val="clear" w:color="auto" w:fill="FFFFFF"/>
+          </w:tcPr>
+          <w:p>
+            <w:r/>
+            <w:r>
+              <w:rPr>
+                <w:b w:val="0"/>
+                <w:sz w:val="16"/>
+              </w:rPr>
+              <w:t>V_DLY_SAMPLING_STRM_GAS_COMP</w:t>
+            </w:r>
+          </w:p>
+        </w:tc>
+        <w:tc>
+          <w:tcPr>
+            <w:tcW w:type="dxa" w:w="1680"/>
+            <w:shd w:val="clear" w:color="auto" w:fill="C6EFCE"/>
+          </w:tcPr>
+          <w:p>
+            <w:pPr>
+              <w:jc w:val="center"/>
+            </w:pPr>
+            <w:r/>
+            <w:r>
+              <w:rPr>
+                <w:b/>
+                <w:sz w:val="16"/>
+              </w:rPr>
+              <w:t>COMP_MOL_PCT</w:t>
+            </w:r>
+          </w:p>
+        </w:tc>
+      </w:tr>
+      <w:tr>
+        <w:tc>
+          <w:tcPr>
+            <w:tcW w:type="dxa" w:w="1680"/>
+            <w:shd w:val="clear" w:color="auto" w:fill="F2F2F2"/>
+          </w:tcPr>
+          <w:p>
+            <w:pPr>
+              <w:jc w:val="center"/>
+            </w:pPr>
+            <w:r/>
+            <w:r>
+              <w:rPr>
+                <w:b w:val="0"/>
+                <w:sz w:val="16"/>
+              </w:rPr>
+              <w:t>1157</w:t>
+            </w:r>
+          </w:p>
+        </w:tc>
+        <w:tc>
+          <w:tcPr>
+            <w:tcW w:type="dxa" w:w="1680"/>
+            <w:shd w:val="clear" w:color="auto" w:fill="F2F2F2"/>
+          </w:tcPr>
+          <w:p>
+            <w:r/>
+            <w:r>
+              <w:rPr>
+                <w:b w:val="0"/>
+                <w:sz w:val="16"/>
+              </w:rPr>
+              <w:t>DAILY_SAMPLING_WELL_GAS_COMPONENT_COMP_MOL_PCT_V1</w:t>
+            </w:r>
+          </w:p>
+        </w:tc>
+        <w:tc>
+          <w:tcPr>
+            <w:tcW w:type="dxa" w:w="1680"/>
+            <w:shd w:val="clear" w:color="auto" w:fill="F2F2F2"/>
+          </w:tcPr>
+          <w:p>
+            <w:r/>
+            <w:r>
+              <w:rPr>
+                <w:b w:val="0"/>
+                <w:sz w:val="16"/>
+              </w:rPr>
+              <w:t>RV_WELL_GAS_ANALYSIS</w:t>
+            </w:r>
+          </w:p>
+        </w:tc>
+        <w:tc>
+          <w:tcPr>
+            <w:tcW w:type="dxa" w:w="1680"/>
+            <w:shd w:val="clear" w:color="auto" w:fill="F2F2F2"/>
+          </w:tcPr>
+          <w:p>
+            <w:pPr>
+              <w:jc w:val="center"/>
+            </w:pPr>
+            <w:r/>
+            <w:r>
+              <w:rPr>
+                <w:b w:val="0"/>
+                <w:sz w:val="16"/>
+              </w:rPr>
+              <w:t>ERROR</w:t>
+            </w:r>
+          </w:p>
+        </w:tc>
+        <w:tc>
+          <w:tcPr>
+            <w:tcW w:type="dxa" w:w="1680"/>
+            <w:shd w:val="clear" w:color="auto" w:fill="F2F2F2"/>
+          </w:tcPr>
+          <w:p>
+            <w:r/>
+            <w:r>
+              <w:rPr>
+                <w:b w:val="0"/>
+                <w:sz w:val="16"/>
+              </w:rPr>
+              <w:t>V_DLY_SAMPLING_WELL_GAS_COMP</w:t>
+            </w:r>
+          </w:p>
+        </w:tc>
+        <w:tc>
+          <w:tcPr>
+            <w:tcW w:type="dxa" w:w="1680"/>
+            <w:shd w:val="clear" w:color="auto" w:fill="C6EFCE"/>
+          </w:tcPr>
+          <w:p>
+            <w:pPr>
+              <w:jc w:val="center"/>
+            </w:pPr>
+            <w:r/>
+            <w:r>
+              <w:rPr>
+                <w:b/>
+                <w:sz w:val="16"/>
+              </w:rPr>
+              <w:t>COMP_MOL_PCT</w:t>
+            </w:r>
+          </w:p>
+        </w:tc>
+      </w:tr>
+    </w:tbl>
+    <w:p/>
+    <w:p>
+      <w:pPr>
+        <w:pStyle w:val="Heading2"/>
+      </w:pPr>
+      <w:r>
+        <w:t>11.4 Mole % Layer-1 unit test</w:t>
+      </w:r>
+    </w:p>
+    <w:p>
+      <w:r>
+        <w:rPr>
+          <w:sz w:val="18"/>
+        </w:rPr>
+        <w:t>STREAM 1156 (real data): valid 1C1401 ANA 2605 sum=100 ret=NO -&gt; PASS; out-of-range 1C1401_TO_E140 ANA 2410 sum=92.15 ret=YES -&gt; FIRES. WELL 1157: real wells carry NO COMP_MOL_PCT (all 26 analyses sum to 0), so proven with reverted fake data on SCA_01 (ANALYSIS_NO 2592, 2026-06-01, open period).</w:t>
+      </w:r>
+    </w:p>
+    <w:tbl>
+      <w:tblPr>
+        <w:tblStyle w:val="TableGrid"/>
+        <w:tblW w:type="auto" w:w="0"/>
+        <w:tblLook w:firstColumn="1" w:firstRow="1" w:lastColumn="0" w:lastRow="0" w:noHBand="0" w:noVBand="1" w:val="04A0"/>
+      </w:tblPr>
+      <w:tblGrid>
+        <w:gridCol w:w="2016"/>
+        <w:gridCol w:w="2016"/>
+        <w:gridCol w:w="2016"/>
+        <w:gridCol w:w="2016"/>
+        <w:gridCol w:w="2016"/>
+      </w:tblGrid>
+      <w:tr>
+        <w:tc>
+          <w:tcPr>
+            <w:tcW w:type="dxa" w:w="2016"/>
+            <w:shd w:val="clear" w:color="auto" w:fill="1F497D"/>
+          </w:tcPr>
+          <w:p>
+            <w:pPr>
+              <w:jc w:val="center"/>
+            </w:pPr>
+            <w:r/>
+            <w:r>
+              <w:rPr>
+                <w:b/>
+                <w:color w:val="FFFFFF"/>
+                <w:sz w:val="16"/>
+              </w:rPr>
+              <w:t>Case</w:t>
+            </w:r>
+          </w:p>
+        </w:tc>
+        <w:tc>
+          <w:tcPr>
+            <w:tcW w:type="dxa" w:w="2016"/>
+            <w:shd w:val="clear" w:color="auto" w:fill="1F497D"/>
+          </w:tcPr>
+          <w:p>
+            <w:pPr>
+              <w:jc w:val="center"/>
+            </w:pPr>
+            <w:r/>
+            <w:r>
+              <w:rPr>
+                <w:b/>
+                <w:color w:val="FFFFFF"/>
+                <w:sz w:val="16"/>
+              </w:rPr>
+              <w:t>Date</w:t>
+            </w:r>
+          </w:p>
+        </w:tc>
+        <w:tc>
+          <w:tcPr>
+            <w:tcW w:type="dxa" w:w="2016"/>
+            <w:shd w:val="clear" w:color="auto" w:fill="1F497D"/>
+          </w:tcPr>
+          <w:p>
+            <w:pPr>
+              <w:jc w:val="center"/>
+            </w:pPr>
+            <w:r/>
+            <w:r>
+              <w:rPr>
+                <w:b/>
+                <w:color w:val="FFFFFF"/>
+                <w:sz w:val="16"/>
+              </w:rPr>
+              <w:t>Data</w:t>
+            </w:r>
+          </w:p>
+        </w:tc>
+        <w:tc>
+          <w:tcPr>
+            <w:tcW w:type="dxa" w:w="2016"/>
+            <w:shd w:val="clear" w:color="auto" w:fill="1F497D"/>
+          </w:tcPr>
+          <w:p>
+            <w:pPr>
+              <w:jc w:val="center"/>
+            </w:pPr>
+            <w:r/>
+            <w:r>
+              <w:rPr>
+                <w:b/>
+                <w:color w:val="FFFFFF"/>
+                <w:sz w:val="16"/>
+              </w:rPr>
+              <w:t>ret</w:t>
+            </w:r>
+          </w:p>
+        </w:tc>
+        <w:tc>
+          <w:tcPr>
+            <w:tcW w:type="dxa" w:w="2016"/>
+            <w:shd w:val="clear" w:color="auto" w:fill="1F497D"/>
+          </w:tcPr>
+          <w:p>
+            <w:pPr>
+              <w:jc w:val="center"/>
+            </w:pPr>
+            <w:r/>
+            <w:r>
+              <w:rPr>
+                <w:b/>
+                <w:color w:val="FFFFFF"/>
+                <w:sz w:val="16"/>
+              </w:rPr>
+              <w:t>Verdict</w:t>
+            </w:r>
+          </w:p>
+        </w:tc>
+      </w:tr>
+      <w:tr>
+        <w:tc>
+          <w:tcPr>
+            <w:tcW w:type="dxa" w:w="2016"/>
+            <w:shd w:val="clear" w:color="auto" w:fill="FFFFFF"/>
+          </w:tcPr>
+          <w:p>
+            <w:r/>
+            <w:r>
+              <w:rPr>
+                <w:b w:val="0"/>
+                <w:sz w:val="17"/>
+              </w:rPr>
+              <w:t>1156 Stream — valid (real)</w:t>
+            </w:r>
+          </w:p>
+        </w:tc>
+        <w:tc>
+          <w:tcPr>
+            <w:tcW w:type="dxa" w:w="2016"/>
+            <w:shd w:val="clear" w:color="auto" w:fill="FFFFFF"/>
+          </w:tcPr>
+          <w:p>
+            <w:pPr>
+              <w:jc w:val="center"/>
+            </w:pPr>
+            <w:r/>
+            <w:r>
+              <w:rPr>
+                <w:b w:val="0"/>
+                <w:sz w:val="17"/>
+              </w:rPr>
+              <w:t>2026-08-31</w:t>
+            </w:r>
+          </w:p>
+        </w:tc>
+        <w:tc>
+          <w:tcPr>
+            <w:tcW w:type="dxa" w:w="2016"/>
+            <w:shd w:val="clear" w:color="auto" w:fill="FFFFFF"/>
+          </w:tcPr>
+          <w:p>
+            <w:r/>
+            <w:r>
+              <w:rPr>
+                <w:b w:val="0"/>
+                <w:sz w:val="17"/>
+              </w:rPr>
+              <w:t>ANA 2605 1C1401 sum=100</w:t>
+            </w:r>
+          </w:p>
+        </w:tc>
+        <w:tc>
+          <w:tcPr>
+            <w:tcW w:type="dxa" w:w="2016"/>
+            <w:shd w:val="clear" w:color="auto" w:fill="FFFFFF"/>
+          </w:tcPr>
+          <w:p>
+            <w:pPr>
+              <w:jc w:val="center"/>
+            </w:pPr>
+            <w:r/>
+            <w:r>
+              <w:rPr>
+                <w:b w:val="0"/>
+                <w:sz w:val="17"/>
+              </w:rPr>
+              <w:t>NO</w:t>
+            </w:r>
+          </w:p>
+        </w:tc>
+        <w:tc>
+          <w:tcPr>
+            <w:tcW w:type="dxa" w:w="2016"/>
+            <w:shd w:val="clear" w:color="auto" w:fill="C6EFCE"/>
+          </w:tcPr>
+          <w:p>
+            <w:pPr>
+              <w:jc w:val="center"/>
+            </w:pPr>
+            <w:r/>
+            <w:r>
+              <w:rPr>
+                <w:b/>
+                <w:sz w:val="18"/>
+              </w:rPr>
+              <w:t>PASS</w:t>
+            </w:r>
+          </w:p>
+        </w:tc>
+      </w:tr>
+      <w:tr>
+        <w:tc>
+          <w:tcPr>
+            <w:tcW w:type="dxa" w:w="2016"/>
+            <w:shd w:val="clear" w:color="auto" w:fill="F2F2F2"/>
+          </w:tcPr>
+          <w:p>
+            <w:r/>
+            <w:r>
+              <w:rPr>
+                <w:b w:val="0"/>
+                <w:sz w:val="17"/>
+              </w:rPr>
+              <w:t>1156 Stream — out-of-range (real)</w:t>
+            </w:r>
+          </w:p>
+        </w:tc>
+        <w:tc>
+          <w:tcPr>
+            <w:tcW w:type="dxa" w:w="2016"/>
+            <w:shd w:val="clear" w:color="auto" w:fill="F2F2F2"/>
+          </w:tcPr>
+          <w:p>
+            <w:pPr>
+              <w:jc w:val="center"/>
+            </w:pPr>
+            <w:r/>
+            <w:r>
+              <w:rPr>
+                <w:b w:val="0"/>
+                <w:sz w:val="17"/>
+              </w:rPr>
+              <w:t>2026-02-03</w:t>
+            </w:r>
+          </w:p>
+        </w:tc>
+        <w:tc>
+          <w:tcPr>
+            <w:tcW w:type="dxa" w:w="2016"/>
+            <w:shd w:val="clear" w:color="auto" w:fill="F2F2F2"/>
+          </w:tcPr>
+          <w:p>
+            <w:r/>
+            <w:r>
+              <w:rPr>
+                <w:b w:val="0"/>
+                <w:sz w:val="17"/>
+              </w:rPr>
+              <w:t>ANA 2410 1C1401_TO_E140 sum=92.15</w:t>
+            </w:r>
+          </w:p>
+        </w:tc>
+        <w:tc>
+          <w:tcPr>
+            <w:tcW w:type="dxa" w:w="2016"/>
+            <w:shd w:val="clear" w:color="auto" w:fill="F2F2F2"/>
+          </w:tcPr>
+          <w:p>
+            <w:pPr>
+              <w:jc w:val="center"/>
+            </w:pPr>
+            <w:r/>
+            <w:r>
+              <w:rPr>
+                <w:b w:val="0"/>
+                <w:sz w:val="17"/>
+              </w:rPr>
+              <w:t>YES</w:t>
+            </w:r>
+          </w:p>
+        </w:tc>
+        <w:tc>
+          <w:tcPr>
+            <w:tcW w:type="dxa" w:w="2016"/>
+            <w:shd w:val="clear" w:color="auto" w:fill="C6EFCE"/>
+          </w:tcPr>
+          <w:p>
+            <w:pPr>
+              <w:jc w:val="center"/>
+            </w:pPr>
+            <w:r/>
+            <w:r>
+              <w:rPr>
+                <w:b/>
+                <w:sz w:val="18"/>
+              </w:rPr>
+              <w:t>FIRES</w:t>
+            </w:r>
+          </w:p>
+        </w:tc>
+      </w:tr>
+      <w:tr>
+        <w:tc>
+          <w:tcPr>
+            <w:tcW w:type="dxa" w:w="2016"/>
+            <w:shd w:val="clear" w:color="auto" w:fill="FFFFFF"/>
+          </w:tcPr>
+          <w:p>
+            <w:r/>
+            <w:r>
+              <w:rPr>
+                <w:b w:val="0"/>
+                <w:sz w:val="17"/>
+              </w:rPr>
+              <w:t>1157 Well — valid (fake, reverted)</w:t>
+            </w:r>
+          </w:p>
+        </w:tc>
+        <w:tc>
+          <w:tcPr>
+            <w:tcW w:type="dxa" w:w="2016"/>
+            <w:shd w:val="clear" w:color="auto" w:fill="FFFFFF"/>
+          </w:tcPr>
+          <w:p>
+            <w:pPr>
+              <w:jc w:val="center"/>
+            </w:pPr>
+            <w:r/>
+            <w:r>
+              <w:rPr>
+                <w:b w:val="0"/>
+                <w:sz w:val="17"/>
+              </w:rPr>
+              <w:t>2026-06-01</w:t>
+            </w:r>
+          </w:p>
+        </w:tc>
+        <w:tc>
+          <w:tcPr>
+            <w:tcW w:type="dxa" w:w="2016"/>
+            <w:shd w:val="clear" w:color="auto" w:fill="FFFFFF"/>
+          </w:tcPr>
+          <w:p>
+            <w:r/>
+            <w:r>
+              <w:rPr>
+                <w:b w:val="0"/>
+                <w:sz w:val="17"/>
+              </w:rPr>
+              <w:t>SCA_01 MOL%=WT% sum=100</w:t>
+            </w:r>
+          </w:p>
+        </w:tc>
+        <w:tc>
+          <w:tcPr>
+            <w:tcW w:type="dxa" w:w="2016"/>
+            <w:shd w:val="clear" w:color="auto" w:fill="FFFFFF"/>
+          </w:tcPr>
+          <w:p>
+            <w:pPr>
+              <w:jc w:val="center"/>
+            </w:pPr>
+            <w:r/>
+            <w:r>
+              <w:rPr>
+                <w:b w:val="0"/>
+                <w:sz w:val="17"/>
+              </w:rPr>
+              <w:t>NO</w:t>
+            </w:r>
+          </w:p>
+        </w:tc>
+        <w:tc>
+          <w:tcPr>
+            <w:tcW w:type="dxa" w:w="2016"/>
+            <w:shd w:val="clear" w:color="auto" w:fill="C6EFCE"/>
+          </w:tcPr>
+          <w:p>
+            <w:pPr>
+              <w:jc w:val="center"/>
+            </w:pPr>
+            <w:r/>
+            <w:r>
+              <w:rPr>
+                <w:b/>
+                <w:sz w:val="18"/>
+              </w:rPr>
+              <w:t>PASS</w:t>
+            </w:r>
+          </w:p>
+        </w:tc>
+      </w:tr>
+      <w:tr>
+        <w:tc>
+          <w:tcPr>
+            <w:tcW w:type="dxa" w:w="2016"/>
+            <w:shd w:val="clear" w:color="auto" w:fill="F2F2F2"/>
+          </w:tcPr>
+          <w:p>
+            <w:r/>
+            <w:r>
+              <w:rPr>
+                <w:b w:val="0"/>
+                <w:sz w:val="17"/>
+              </w:rPr>
+              <w:t>1157 Well — below (fake, reverted)</w:t>
+            </w:r>
+          </w:p>
+        </w:tc>
+        <w:tc>
+          <w:tcPr>
+            <w:tcW w:type="dxa" w:w="2016"/>
+            <w:shd w:val="clear" w:color="auto" w:fill="F2F2F2"/>
+          </w:tcPr>
+          <w:p>
+            <w:pPr>
+              <w:jc w:val="center"/>
+            </w:pPr>
+            <w:r/>
+            <w:r>
+              <w:rPr>
+                <w:b w:val="0"/>
+                <w:sz w:val="17"/>
+              </w:rPr>
+              <w:t>2026-06-01</w:t>
+            </w:r>
+          </w:p>
+        </w:tc>
+        <w:tc>
+          <w:tcPr>
+            <w:tcW w:type="dxa" w:w="2016"/>
+            <w:shd w:val="clear" w:color="auto" w:fill="F2F2F2"/>
+          </w:tcPr>
+          <w:p>
+            <w:r/>
+            <w:r>
+              <w:rPr>
+                <w:b w:val="0"/>
+                <w:sz w:val="17"/>
+              </w:rPr>
+              <w:t>SCA_01 x0.90 sum=90</w:t>
+            </w:r>
+          </w:p>
+        </w:tc>
+        <w:tc>
+          <w:tcPr>
+            <w:tcW w:type="dxa" w:w="2016"/>
+            <w:shd w:val="clear" w:color="auto" w:fill="F2F2F2"/>
+          </w:tcPr>
+          <w:p>
+            <w:pPr>
+              <w:jc w:val="center"/>
+            </w:pPr>
+            <w:r/>
+            <w:r>
+              <w:rPr>
+                <w:b w:val="0"/>
+                <w:sz w:val="17"/>
+              </w:rPr>
+              <w:t>YES</w:t>
+            </w:r>
+          </w:p>
+        </w:tc>
+        <w:tc>
+          <w:tcPr>
+            <w:tcW w:type="dxa" w:w="2016"/>
+            <w:shd w:val="clear" w:color="auto" w:fill="C6EFCE"/>
+          </w:tcPr>
+          <w:p>
+            <w:pPr>
+              <w:jc w:val="center"/>
+            </w:pPr>
+            <w:r/>
+            <w:r>
+              <w:rPr>
+                <w:b/>
+                <w:sz w:val="18"/>
+              </w:rPr>
+              <w:t>FIRES</w:t>
+            </w:r>
+          </w:p>
+        </w:tc>
+      </w:tr>
+      <w:tr>
+        <w:tc>
+          <w:tcPr>
+            <w:tcW w:type="dxa" w:w="2016"/>
+            <w:shd w:val="clear" w:color="auto" w:fill="FFFFFF"/>
+          </w:tcPr>
+          <w:p>
+            <w:r/>
+            <w:r>
+              <w:rPr>
+                <w:b w:val="0"/>
+                <w:sz w:val="17"/>
+              </w:rPr>
+              <w:t>1157 Well — above (fake, reverted)</w:t>
+            </w:r>
+          </w:p>
+        </w:tc>
+        <w:tc>
+          <w:tcPr>
+            <w:tcW w:type="dxa" w:w="2016"/>
+            <w:shd w:val="clear" w:color="auto" w:fill="FFFFFF"/>
+          </w:tcPr>
+          <w:p>
+            <w:pPr>
+              <w:jc w:val="center"/>
+            </w:pPr>
+            <w:r/>
+            <w:r>
+              <w:rPr>
+                <w:b w:val="0"/>
+                <w:sz w:val="17"/>
+              </w:rPr>
+              <w:t>2026-06-01</w:t>
+            </w:r>
+          </w:p>
+        </w:tc>
+        <w:tc>
+          <w:tcPr>
+            <w:tcW w:type="dxa" w:w="2016"/>
+            <w:shd w:val="clear" w:color="auto" w:fill="FFFFFF"/>
+          </w:tcPr>
+          <w:p>
+            <w:r/>
+            <w:r>
+              <w:rPr>
+                <w:b w:val="0"/>
+                <w:sz w:val="17"/>
+              </w:rPr>
+              <w:t>SCA_01 x1.10 sum=110</w:t>
+            </w:r>
+          </w:p>
+        </w:tc>
+        <w:tc>
+          <w:tcPr>
+            <w:tcW w:type="dxa" w:w="2016"/>
+            <w:shd w:val="clear" w:color="auto" w:fill="FFFFFF"/>
+          </w:tcPr>
+          <w:p>
+            <w:pPr>
+              <w:jc w:val="center"/>
+            </w:pPr>
+            <w:r/>
+            <w:r>
+              <w:rPr>
+                <w:b w:val="0"/>
+                <w:sz w:val="17"/>
+              </w:rPr>
+              <w:t>YES</w:t>
+            </w:r>
+          </w:p>
+        </w:tc>
+        <w:tc>
+          <w:tcPr>
+            <w:tcW w:type="dxa" w:w="2016"/>
+            <w:shd w:val="clear" w:color="auto" w:fill="C6EFCE"/>
+          </w:tcPr>
+          <w:p>
+            <w:pPr>
+              <w:jc w:val="center"/>
+            </w:pPr>
+            <w:r/>
+            <w:r>
+              <w:rPr>
+                <w:b/>
+                <w:sz w:val="18"/>
+              </w:rPr>
+              <w:t>FIRES</w:t>
+            </w:r>
+          </w:p>
+        </w:tc>
+      </w:tr>
+    </w:tbl>
+    <w:p>
+      <w:r>
+        <w:rPr>
+          <w:sz w:val="18"/>
+        </w:rPr>
+        <w:t>Open item (data, not rule): real wells have no COMP_MOL_PCT, so rule 1157 fires on all 26 real wells until mole-% data is populated. Decision pending (keep live / unlink / escalate to Grant).</w:t>
+      </w:r>
+    </w:p>
+    <w:tbl>
+      <w:tblPr>
+        <w:tblStyle w:val="TableGrid"/>
+        <w:tblW w:type="auto" w:w="0"/>
+        <w:tblLook w:firstColumn="1" w:firstRow="1" w:lastColumn="0" w:lastRow="0" w:noHBand="0" w:noVBand="1" w:val="04A0"/>
+      </w:tblPr>
+      <w:tblGrid>
+        <w:gridCol w:w="10080"/>
+      </w:tblGrid>
+      <w:tr>
+        <w:tc>
+          <w:tcPr>
+            <w:tcW w:type="dxa" w:w="10080"/>
+            <w:shd w:val="clear" w:color="auto" w:fill="00B050"/>
+          </w:tcPr>
+          <w:p>
+            <w:pPr>
+              <w:jc w:val="center"/>
+            </w:pPr>
+            <w:r/>
+            <w:r>
+              <w:rPr>
+                <w:b/>
+                <w:color w:val="FFFFFF"/>
+                <w:sz w:val="21"/>
+              </w:rPr>
+              <w:t>SUM 98-102% CHECK:  defect FIXED  |  WT% (1077/1083) re-verified  |  MOL% (1156/1157) deployed &amp; tested</w:t>
+            </w:r>
+          </w:p>
+        </w:tc>
+      </w:tr>
+    </w:tbl>
+    <w:p>
+      <w:pPr>
+        <w:pStyle w:val="Heading2"/>
+      </w:pPr>
+      <w:r>
+        <w:t>11.5  EC Web Screen Evidence — Validation Overview (sum-check ERRORs on screen)</w:t>
+      </w:r>
+    </w:p>
+    <w:p>
+      <w:r>
+        <w:rPr>
+          <w:sz w:val="18"/>
+        </w:rPr>
+        <w:t>Captured headless via Robot Framework on COPS DEV (sum_check_evidence / sum_one_capture). The Validation Overview screen runs the daily-sampling gas-component groups; the result grid is filtered on the Message column to isolate each rule. Row counts were asserted in the run (mole-only: molecular-weight=0; WT-only: mole=0).</w:t>
+      </w:r>
+    </w:p>
+    <w:p>
+      <w:pPr>
+        <w:pStyle w:val="Heading3"/>
+      </w:pPr>
+      <w:r>
+        <w:t>11.5.1  Stream Gas Component Analysis — MOLE % sum check (rule 1156, NEW)</w:t>
+      </w:r>
+    </w:p>
+    <w:p>
+      <w:r>
+        <w:rPr>
+          <w:color w:val="606060"/>
+          <w:sz w:val="17"/>
+        </w:rPr>
+        <w:t>Validation Overview - Pluto Scarborough &gt; Daily Sampling Validations &gt; Stream Gas Component Analysis group, May 2026. Message column filtered to 'mole percentage': every row is the new COMP_MOL_PCT sum-check ERROR firing on screen (group status ERROR).</w:t>
+      </w:r>
+    </w:p>
+    <w:p>
+      <w:pPr>
+        <w:jc w:val="center"/>
+      </w:pPr>
+      <w:r>
+        <w:drawing>
+          <wp:inline xmlns:a="http://schemas.openxmlformats.org/drawingml/2006/main" xmlns:pic="http://schemas.openxmlformats.org/drawingml/2006/picture">
+            <wp:extent cx="6217920" cy="3497580"/>
+            <wp:docPr id="5" name="Picture 5"/>
+            <wp:cNvGraphicFramePr>
+              <a:graphicFrameLocks noChangeAspect="1"/>
+            </wp:cNvGraphicFramePr>
+            <a:graphic>
+              <a:graphicData uri="http://schemas.openxmlformats.org/drawingml/2006/picture">
+                <pic:pic>
+                  <pic:nvPicPr>
+                    <pic:cNvPr id="0" name="sum_stream_MOLE_pct.png"/>
+                    <pic:cNvPicPr/>
+                  </pic:nvPicPr>
+                  <pic:blipFill>
+                    <a:blip r:embed="rId24"/>
+                    <a:stretch>
+                      <a:fillRect/>
+                    </a:stretch>
+                  </pic:blipFill>
+                  <pic:spPr>
+                    <a:xfrm>
+                      <a:off x="0" y="0"/>
+                      <a:ext cx="6217920" cy="3497580"/>
+                    </a:xfrm>
+                    <a:prstGeom prst="rect"/>
+                  </pic:spPr>
+                </pic:pic>
+              </a:graphicData>
+            </a:graphic>
+          </wp:inline>
+        </w:drawing>
+      </w:r>
+    </w:p>
+    <w:p/>
+    <w:p>
+      <w:pPr>
+        <w:pStyle w:val="Heading3"/>
+      </w:pPr>
+      <w:r>
+        <w:t>11.5.2  Stream Gas Component Analysis — WEIGHT % sum check (rule 1077)</w:t>
+      </w:r>
+    </w:p>
+    <w:p>
+      <w:r>
+        <w:rPr>
+          <w:color w:val="606060"/>
+          <w:sz w:val="17"/>
+        </w:rPr>
+        <w:t>Same group/date, Message filtered to 'molecular weight percentage': the existing COMP_WT_PCT sum-check ERRORs (verified still firing post-fix).</w:t>
+      </w:r>
+    </w:p>
+    <w:p>
+      <w:pPr>
+        <w:jc w:val="center"/>
+      </w:pPr>
+      <w:r>
+        <w:drawing>
+          <wp:inline xmlns:a="http://schemas.openxmlformats.org/drawingml/2006/main" xmlns:pic="http://schemas.openxmlformats.org/drawingml/2006/picture">
+            <wp:extent cx="6217920" cy="3497580"/>
+            <wp:docPr id="6" name="Picture 6"/>
+            <wp:cNvGraphicFramePr>
+              <a:graphicFrameLocks noChangeAspect="1"/>
+            </wp:cNvGraphicFramePr>
+            <a:graphic>
+              <a:graphicData uri="http://schemas.openxmlformats.org/drawingml/2006/picture">
+                <pic:pic>
+                  <pic:nvPicPr>
+                    <pic:cNvPr id="0" name="sum_stream_WT_pct.png"/>
+                    <pic:cNvPicPr/>
+                  </pic:nvPicPr>
+                  <pic:blipFill>
+                    <a:blip r:embed="rId25"/>
+                    <a:stretch>
+                      <a:fillRect/>
+                    </a:stretch>
+                  </pic:blipFill>
+                  <pic:spPr>
+                    <a:xfrm>
+                      <a:off x="0" y="0"/>
+                      <a:ext cx="6217920" cy="3497580"/>
+                    </a:xfrm>
+                    <a:prstGeom prst="rect"/>
+                  </pic:spPr>
+                </pic:pic>
+              </a:graphicData>
+            </a:graphic>
+          </wp:inline>
+        </w:drawing>
+      </w:r>
+    </w:p>
+    <w:p/>
+    <w:p>
+      <w:pPr>
+        <w:pStyle w:val="Heading3"/>
+      </w:pPr>
+      <w:r>
+        <w:t>11.5.3  Well Gas Component Analysis — MOLE % sum check (rule 1157, NEW)</w:t>
+      </w:r>
+    </w:p>
+    <w:p>
+      <w:r>
+        <w:rPr>
+          <w:color w:val="606060"/>
+          <w:sz w:val="17"/>
+        </w:rPr>
+        <w:t>Well Gas Component Analysis group, 2026-06-01, filtered to 'mole percentage': 13 SCA wells firing the new COMP_MOL_PCT sum-check ERROR (wells carry no mole % data).</w:t>
+      </w:r>
+    </w:p>
+    <w:p>
+      <w:pPr>
+        <w:jc w:val="center"/>
+      </w:pPr>
+      <w:r>
+        <w:drawing>
+          <wp:inline xmlns:a="http://schemas.openxmlformats.org/drawingml/2006/main" xmlns:pic="http://schemas.openxmlformats.org/drawingml/2006/picture">
+            <wp:extent cx="6217920" cy="3497580"/>
+            <wp:docPr id="7" name="Picture 7"/>
+            <wp:cNvGraphicFramePr>
+              <a:graphicFrameLocks noChangeAspect="1"/>
+            </wp:cNvGraphicFramePr>
+            <a:graphic>
+              <a:graphicData uri="http://schemas.openxmlformats.org/drawingml/2006/picture">
+                <pic:pic>
+                  <pic:nvPicPr>
+                    <pic:cNvPr id="0" name="sum_well_MOLE_pct.png"/>
+                    <pic:cNvPicPr/>
+                  </pic:nvPicPr>
+                  <pic:blipFill>
+                    <a:blip r:embed="rId26"/>
+                    <a:stretch>
+                      <a:fillRect/>
+                    </a:stretch>
+                  </pic:blipFill>
+                  <pic:spPr>
+                    <a:xfrm>
+                      <a:off x="0" y="0"/>
+                      <a:ext cx="6217920" cy="3497580"/>
+                    </a:xfrm>
+                    <a:prstGeom prst="rect"/>
+                  </pic:spPr>
+                </pic:pic>
+              </a:graphicData>
+            </a:graphic>
+          </wp:inline>
+        </w:drawing>
+      </w:r>
+    </w:p>
+    <w:p/>
+    <w:p>
+      <w:pPr>
+        <w:pStyle w:val="Heading2"/>
+      </w:pPr>
+      <w:r>
+        <w:t>11.6  Sum MOL% rules deployed — Check Rule maintenance screen</w:t>
+      </w:r>
+    </w:p>
+    <w:p>
+      <w:r>
+        <w:rPr>
+          <w:color w:val="606060"/>
+          <w:sz w:val="17"/>
+        </w:rPr>
+        <w:t>Check Rule screen filtered to "GAS_COMPONENT_COMP_MOL_PCT": the two new sum rules 1156 (stream) and 1157 (well) configured — RV view RV_STRM/WELL_GAS_ANALYSIS, Where Formula (${isComponentSumOutOfTolerance} = ${ConstYES}), Severity ERROR.</w:t>
+      </w:r>
+    </w:p>
+    <w:p>
+      <w:pPr>
+        <w:jc w:val="center"/>
+      </w:pPr>
+      <w:r>
+        <w:drawing>
+          <wp:inline xmlns:a="http://schemas.openxmlformats.org/drawingml/2006/main" xmlns:pic="http://schemas.openxmlformats.org/drawingml/2006/picture">
+            <wp:extent cx="6217920" cy="3497580"/>
+            <wp:docPr id="14" name="Picture 14"/>
+            <wp:cNvGraphicFramePr>
+              <a:graphicFrameLocks noChangeAspect="1"/>
+            </wp:cNvGraphicFramePr>
+            <a:graphic>
+              <a:graphicData uri="http://schemas.openxmlformats.org/drawingml/2006/picture">
+                <pic:pic>
+                  <pic:nvPicPr>
+                    <pic:cNvPr id="0" name="check_rule_MOLPCT.png"/>
+                    <pic:cNvPicPr/>
+                  </pic:nvPicPr>
+                  <pic:blipFill>
+                    <a:blip r:embed="rId33"/>
+                    <a:stretch>
+                      <a:fillRect/>
+                    </a:stretch>
+                  </pic:blipFill>
+                  <pic:spPr>
+                    <a:xfrm>
+                      <a:off x="0" y="0"/>
+                      <a:ext cx="6217920" cy="3497580"/>
+                    </a:xfrm>
+                    <a:prstGeom prst="rect"/>
+                  </pic:spPr>
+                </pic:pic>
+              </a:graphicData>
+            </a:graphic>
+          </wp:inline>
+        </w:drawing>
+      </w:r>
+    </w:p>
+    <w:p/>
+    <w:p>
+      <w:pPr>
+        <w:pStyle w:val="Heading2"/>
+      </w:pPr>
+      <w:r>
+        <w:t>11.7  Well MOL% rule PASSES with valid data — fake-data test (reverted)</w:t>
+      </w:r>
+    </w:p>
+    <w:p>
+      <w:r>
+        <w:rPr>
+          <w:color w:val="606060"/>
+          <w:sz w:val="17"/>
+        </w:rPr>
+        <w:t>Real wells carry no COMP_MOL_PCT (all fire). To prove rule 1157 PASSES valid data (not just fires on missing data), SCA_01 was temporarily patched to a valid 100% mole sum (Issue1052_PHD_Sum_MolPct_FakeData_Patch.sql), the well group re-run, then reverted. The mole% errors drop 13 -&gt; 12: SCA 02-13 still fire, SCA 01 is absent (PASSES). COPS DEV reverted byte-clean (SCA_01 MOL% back to NULL; CTRL_CHECK_LOG restored to 13).</w:t>
+      </w:r>
+    </w:p>
+    <w:p>
+      <w:pPr>
+        <w:jc w:val="center"/>
+      </w:pPr>
+      <w:r>
+        <w:drawing>
+          <wp:inline xmlns:a="http://schemas.openxmlformats.org/drawingml/2006/main" xmlns:pic="http://schemas.openxmlformats.org/drawingml/2006/picture">
+            <wp:extent cx="6217920" cy="3497580"/>
+            <wp:docPr id="15" name="Picture 15"/>
+            <wp:cNvGraphicFramePr>
+              <a:graphicFrameLocks noChangeAspect="1"/>
+            </wp:cNvGraphicFramePr>
+            <a:graphic>
+              <a:graphicData uri="http://schemas.openxmlformats.org/drawingml/2006/picture">
+                <pic:pic>
+                  <pic:nvPicPr>
+                    <pic:cNvPr id="0" name="sum_well_PASS_fakedata.png"/>
+                    <pic:cNvPicPr/>
+                  </pic:nvPicPr>
+                  <pic:blipFill>
+                    <a:blip r:embed="rId34"/>
+                    <a:stretch>
+                      <a:fillRect/>
+                    </a:stretch>
+                  </pic:blipFill>
+                  <pic:spPr>
+                    <a:xfrm>
+                      <a:off x="0" y="0"/>
+                      <a:ext cx="6217920" cy="3497580"/>
+                    </a:xfrm>
+                    <a:prstGeom prst="rect"/>
+                  </pic:spPr>
+                </pic:pic>
+              </a:graphicData>
+            </a:graphic>
+          </wp:inline>
+        </w:drawing>
+      </w:r>
+    </w:p>
+    <w:p/>
     <w:sectPr>
       <w:headerReference w:type="default" r:id="rId16"/>
       <w:footerReference w:type="default" r:id="rId17"/>

</xml_diff>